<commit_message>
Update morphosyntactic transfer paper and materials
</commit_message>
<xml_diff>
--- a/paper_1_transfer/paper_1_morphosyntax.docx
+++ b/paper_1_transfer/paper_1_morphosyntax.docx
@@ -2966,7 +2966,7 @@
     </w:p>
     <w:bookmarkEnd w:id="59"/>
     <w:bookmarkEnd w:id="60"/>
-    <w:bookmarkStart w:id="85" w:name="method"/>
+    <w:bookmarkStart w:id="93" w:name="method"/>
     <w:p>
       <w:pPr>
         <w:pStyle w:val="Heading1"/>
@@ -4171,7 +4171,25 @@
         <w:t xml:space="preserve"> </w:t>
       </w:r>
       <w:r>
-        <w:t xml:space="preserve">fell inside the analysed epoch.</w:t>
+        <w:t xml:space="preserve">fell inside the analysed epoch. Participants were instructed to minimise movement and</w:t>
+      </w:r>
+      <w:r>
+        <w:t xml:space="preserve"> </w:t>
+      </w:r>
+      <w:r>
+        <w:t xml:space="preserve">blinking, especially during the presentation of words. During pauses in these long</w:t>
+      </w:r>
+      <w:r>
+        <w:t xml:space="preserve"> </w:t>
+      </w:r>
+      <w:r>
+        <w:t xml:space="preserve">sessions, experimenters monitored the signal and intervened when necessary to maintain</w:t>
+      </w:r>
+      <w:r>
+        <w:t xml:space="preserve"> </w:t>
+      </w:r>
+      <w:r>
+        <w:t xml:space="preserve">low electrode impedance and acceptable signal quality.</w:t>
       </w:r>
     </w:p>
     <w:p>
@@ -4249,7 +4267,7 @@
       </w:r>
     </w:p>
     <w:bookmarkEnd w:id="67"/>
-    <w:bookmarkStart w:id="70" w:name="X0ccf509cef4fa979be3aa2297c27549cad40b40"/>
+    <w:bookmarkStart w:id="78" w:name="X0ccf509cef4fa979be3aa2297c27549cad40b40"/>
     <w:p>
       <w:pPr>
         <w:pStyle w:val="Heading2"/>
@@ -4695,36 +4713,273 @@
       <w:r>
         <w:t xml:space="preserve">condition, and the two prove effectively equal.</w:t>
       </w:r>
-      <w:r>
-        <w:t xml:space="preserve"> </w:t>
-      </w:r>
-      <w:r>
-        <w:t xml:space="preserve">Averaged over properties and sessions, 31.4 trials were retained</w:t>
-      </w:r>
-      <w:r>
-        <w:t xml:space="preserve"> </w:t>
-      </w:r>
-      <w:r>
-        <w:t xml:space="preserve">on grammatical trials and</w:t>
-      </w:r>
-      <w:r>
-        <w:t xml:space="preserve"> </w:t>
-      </w:r>
-      <w:r>
-        <w:t xml:space="preserve">31.4 on ungrammatical trials, a difference of</w:t>
-      </w:r>
-      <w:r>
-        <w:t xml:space="preserve"> </w:t>
-      </w:r>
-      <w:r>
-        <w:t xml:space="preserve">0.02 trials.</w:t>
-      </w:r>
     </w:p>
     <w:p>
       <w:pPr>
         <w:pStyle w:val="BodyText"/>
       </w:pPr>
       <w:r>
+        <w:t xml:space="preserve">The observed elapsed duration of each home task and of each phase of the laboratory</w:t>
+      </w:r>
+      <w:r>
+        <w:t xml:space="preserve"> </w:t>
+      </w:r>
+      <w:r>
+        <w:t xml:space="preserve">sessions is shown in</w:t>
+      </w:r>
+      <w:r>
+        <w:t xml:space="preserve"> </w:t>
+      </w:r>
+      <w:hyperlink w:anchor="fig-home-task-duration">
+        <w:r>
+          <w:rPr>
+            <w:rStyle w:val="Hyperlink"/>
+          </w:rPr>
+          <w:t xml:space="preserve">Figure 4</w:t>
+        </w:r>
+      </w:hyperlink>
+      <w:r>
+        <w:t xml:space="preserve"> </w:t>
+      </w:r>
+      <w:r>
+        <w:t xml:space="preserve">and</w:t>
+      </w:r>
+      <w:r>
+        <w:t xml:space="preserve"> </w:t>
+      </w:r>
+      <w:hyperlink w:anchor="fig-lab-phase-duration">
+        <w:r>
+          <w:rPr>
+            <w:rStyle w:val="Hyperlink"/>
+          </w:rPr>
+          <w:t xml:space="preserve">Figure 5</w:t>
+        </w:r>
+      </w:hyperlink>
+      <w:r>
+        <w:t xml:space="preserve">. These are</w:t>
+      </w:r>
+      <w:r>
+        <w:t xml:space="preserve"> </w:t>
+      </w:r>
+      <w:r>
+        <w:t xml:space="preserve">descriptive timing checks, not additional outcomes: home-task duration runs from the</w:t>
+      </w:r>
+      <w:r>
+        <w:t xml:space="preserve"> </w:t>
+      </w:r>
+      <w:r>
+        <w:t xml:space="preserve">first to the last Gorilla event for each participant and task, whereas lab-phase duration</w:t>
+      </w:r>
+      <w:r>
+        <w:t xml:space="preserve"> </w:t>
+      </w:r>
+      <w:r>
+        <w:t xml:space="preserve">uses the OpenSesame phase markers and the final event in a phase when the next phase was</w:t>
+      </w:r>
+      <w:r>
+        <w:t xml:space="preserve"> </w:t>
+      </w:r>
+      <w:r>
+        <w:t xml:space="preserve">recorded in a separate export.</w:t>
+      </w:r>
+      <w:r>
+        <w:t xml:space="preserve"> </w:t>
+      </w:r>
+      <w:r>
+        <w:t xml:space="preserve">The median home-task durations were 4.45 min for Stroop, 11.98 min for digit span and 36.94 min for ASRT in Session 1, and 3.71, 11.32 and 35.61 min, respectively, in Session 5. Median laboratory-phase durations (pretraining, training, test and experiment) were 4.21, 16.14, 9.93 and 47.49 min in Session 2; 1.57, 18.97, 7.18 and 52.54 min in Session 3; 16.73, 20.08 and 78.37 min for training, test and experiment in Session 4, where pretraining was not recorded; and 73.42 min for the experiment in Session 6, where the other phases were not recorded.</w:t>
+      </w:r>
+    </w:p>
+    <w:bookmarkStart w:id="72" w:name="fig-home-task-duration"/>
+    <w:p>
+      <w:pPr>
+        <w:pStyle w:val="FigureTitle"/>
+      </w:pPr>
+      <w:r>
+        <w:t xml:space="preserve">Figure 4</w:t>
+      </w:r>
+    </w:p>
+    <w:p>
+      <w:pPr>
+        <w:pStyle w:val="Caption"/>
+      </w:pPr>
+      <w:r>
+        <w:t xml:space="preserve">Duration of the Home Cognitive Tasks by Session</w:t>
+      </w:r>
+    </w:p>
+    <w:p>
+      <w:pPr>
+        <w:pStyle w:val="FigureWithNote"/>
+      </w:pPr>
+      <w:r>
+        <w:drawing>
+          <wp:inline>
+            <wp:extent cx="5943600" cy="2651759"/>
+            <wp:effectExtent b="0" l="0" r="0" t="0"/>
+            <wp:docPr descr="" title="" id="70" name="Picture"/>
+            <a:graphic>
+              <a:graphicData uri="http://schemas.openxmlformats.org/drawingml/2006/picture">
+                <pic:pic>
+                  <pic:nvPicPr>
+                    <pic:cNvPr descr="paper_1_morphosyntax_files/figure-docx/fig-home-task-duration-1.png" id="71" name="Picture"/>
+                    <pic:cNvPicPr>
+                      <a:picLocks noChangeArrowheads="1" noChangeAspect="1"/>
+                    </pic:cNvPicPr>
+                  </pic:nvPicPr>
+                  <pic:blipFill>
+                    <a:blip r:embed="rId69"/>
+                    <a:stretch>
+                      <a:fillRect/>
+                    </a:stretch>
+                  </pic:blipFill>
+                  <pic:spPr bwMode="auto">
+                    <a:xfrm>
+                      <a:off x="0" y="0"/>
+                      <a:ext cx="5943600" cy="2651759"/>
+                    </a:xfrm>
+                    <a:prstGeom prst="rect">
+                      <a:avLst/>
+                    </a:prstGeom>
+                    <a:noFill/>
+                    <a:ln w="9525">
+                      <a:noFill/>
+                      <a:headEnd/>
+                      <a:tailEnd/>
+                    </a:ln>
+                  </pic:spPr>
+                </pic:pic>
+              </a:graphicData>
+            </a:graphic>
+          </wp:inline>
+        </w:drawing>
+      </w:r>
+    </w:p>
+    <w:bookmarkEnd w:id="72"/>
+    <w:p>
+      <w:pPr>
+        <w:pStyle w:val="FigureNote"/>
+      </w:pPr>
+      <w:r>
+        <w:rPr>
+          <w:i/>
+          <w:iCs/>
+        </w:rPr>
+        <w:t xml:space="preserve">Note</w:t>
+      </w:r>
+      <w:r>
+        <w:t xml:space="preserve">. Each box summarises the distribution across participants of elapsed time from the first to the last raw Gorilla event for one task and session; the centre line is the median, the box spans the interquartile range, and whiskers extend to 1.5 times the interquartile range. Sessions 1 and 5 are baseline and post-training, respectively. Durations therefore include instructions, practice and test material when those events are present in the export. The ordinate is logarithmic because five exports contain multi-hour idle gaps; those observations remain as outliers. Participants without a linked enrolled-participant key are excluded.</w:t>
+      </w:r>
+    </w:p>
+    <w:bookmarkStart w:id="76" w:name="fig-lab-phase-duration"/>
+    <w:p>
+      <w:pPr>
+        <w:pStyle w:val="FigureTitle"/>
+      </w:pPr>
+      <w:r>
+        <w:t xml:space="preserve">Figure 5</w:t>
+      </w:r>
+    </w:p>
+    <w:p>
+      <w:pPr>
+        <w:pStyle w:val="Caption"/>
+      </w:pPr>
+      <w:r>
+        <w:t xml:space="preserve">Duration of the Laboratory-Session Phases</w:t>
+      </w:r>
+    </w:p>
+    <w:p>
+      <w:pPr>
+        <w:pStyle w:val="FigureWithNote"/>
+      </w:pPr>
+      <w:r>
+        <w:drawing>
+          <wp:inline>
+            <wp:extent cx="5943600" cy="2743199"/>
+            <wp:effectExtent b="0" l="0" r="0" t="0"/>
+            <wp:docPr descr="" title="" id="74" name="Picture"/>
+            <a:graphic>
+              <a:graphicData uri="http://schemas.openxmlformats.org/drawingml/2006/picture">
+                <pic:pic>
+                  <pic:nvPicPr>
+                    <pic:cNvPr descr="paper_1_morphosyntax_files/figure-docx/fig-lab-phase-duration-1.png" id="75" name="Picture"/>
+                    <pic:cNvPicPr>
+                      <a:picLocks noChangeArrowheads="1" noChangeAspect="1"/>
+                    </pic:cNvPicPr>
+                  </pic:nvPicPr>
+                  <pic:blipFill>
+                    <a:blip r:embed="rId73"/>
+                    <a:stretch>
+                      <a:fillRect/>
+                    </a:stretch>
+                  </pic:blipFill>
+                  <pic:spPr bwMode="auto">
+                    <a:xfrm>
+                      <a:off x="0" y="0"/>
+                      <a:ext cx="5943600" cy="2743199"/>
+                    </a:xfrm>
+                    <a:prstGeom prst="rect">
+                      <a:avLst/>
+                    </a:prstGeom>
+                    <a:noFill/>
+                    <a:ln w="9525">
+                      <a:noFill/>
+                      <a:headEnd/>
+                      <a:tailEnd/>
+                    </a:ln>
+                  </pic:spPr>
+                </pic:pic>
+              </a:graphicData>
+            </a:graphic>
+          </wp:inline>
+        </w:drawing>
+      </w:r>
+    </w:p>
+    <w:bookmarkEnd w:id="76"/>
+    <w:p>
+      <w:pPr>
+        <w:pStyle w:val="FigureNote"/>
+      </w:pPr>
+      <w:r>
+        <w:rPr>
+          <w:i/>
+          <w:iCs/>
+        </w:rPr>
+        <w:t xml:space="preserve">Note</w:t>
+      </w:r>
+      <w:r>
+        <w:t xml:space="preserve">. Each box summarises the distribution across participants of elapsed time in one laboratory-session phase and session; the centre line is the median, the box spans the interquartile range, and whiskers extend to 1.5 times the interquartile range. Phase duration is measured between the recorded phase-start markers, or from a phase start to the last phase-specific event when the next phase was exported separately. Sessions 2, 3 and 4 are training sessions and Session 6 is the retention session.</w:t>
+      </w:r>
+    </w:p>
+    <w:p>
+      <w:pPr>
+        <w:pStyle w:val="BodyText"/>
+      </w:pPr>
+      <w:r>
+        <w:t xml:space="preserve">Averaged over properties and sessions, 31.4 trials were retained</w:t>
+      </w:r>
+      <w:r>
+        <w:t xml:space="preserve"> </w:t>
+      </w:r>
+      <w:r>
+        <w:t xml:space="preserve">on grammatical trials and</w:t>
+      </w:r>
+      <w:r>
+        <w:t xml:space="preserve"> </w:t>
+      </w:r>
+      <w:r>
+        <w:t xml:space="preserve">31.4 on ungrammatical trials, a difference of</w:t>
+      </w:r>
+      <w:r>
+        <w:t xml:space="preserve"> </w:t>
+      </w:r>
+      <w:r>
+        <w:t xml:space="preserve">0.02 trials.</w:t>
+      </w:r>
+    </w:p>
+    <w:p>
+      <w:pPr>
+        <w:pStyle w:val="BodyText"/>
+      </w:pPr>
+      <w:r>
         <w:t xml:space="preserve">For each retained trial, we computed the mean amplitude in three theoretically</w:t>
       </w:r>
       <w:r>
@@ -4891,7 +5146,7 @@
         <w:t xml:space="preserve">.</w:t>
       </w:r>
     </w:p>
-    <w:bookmarkStart w:id="69" w:name="tbl-retention-trials"/>
+    <w:bookmarkStart w:id="77" w:name="tbl-retention-trials"/>
     <w:p>
       <w:pPr>
         <w:pStyle w:val="FigureTitle"/>
@@ -5444,7 +5699,7 @@
         </w:tc>
       </w:tr>
     </w:tbl>
-    <w:bookmarkEnd w:id="69"/>
+    <w:bookmarkEnd w:id="77"/>
     <w:p>
       <w:pPr>
         <w:pStyle w:val="FigureNote"/>
@@ -5460,8 +5715,8 @@
         <w:t xml:space="preserve">. Values are mean trials retained of the 48 presented, averaged over language. Rows are split by grammaticality because differential trial loss across the compared conditions can bias both amplitude and decodability. The two conditions are retained almost equally here (see text). An n/a entry marks a session at which the property had not yet been introduced. Like the grand averages, the table is computed on the full sample, including the four mis-filtered Session 3 datasets that the models exclude.</w:t>
       </w:r>
     </w:p>
-    <w:bookmarkEnd w:id="70"/>
-    <w:bookmarkStart w:id="71" w:name="grammaticality-judgement-task"/>
+    <w:bookmarkEnd w:id="78"/>
+    <w:bookmarkStart w:id="79" w:name="grammaticality-judgement-task"/>
     <w:p>
       <w:pPr>
         <w:pStyle w:val="Heading2"/>
@@ -5593,8 +5848,8 @@
         <w:t xml:space="preserve">).</w:t>
       </w:r>
     </w:p>
-    <w:bookmarkEnd w:id="71"/>
-    <w:bookmarkStart w:id="82" w:name="data-analysis"/>
+    <w:bookmarkEnd w:id="79"/>
+    <w:bookmarkStart w:id="90" w:name="data-analysis"/>
     <w:p>
       <w:pPr>
         <w:pStyle w:val="Heading2"/>
@@ -5737,7 +5992,7 @@
         <w:t xml:space="preserve">without the tool.</w:t>
       </w:r>
     </w:p>
-    <w:bookmarkStart w:id="72" w:name="predictor-coding-and-standardisation"/>
+    <w:bookmarkStart w:id="80" w:name="predictor-coding-and-standardisation"/>
     <w:p>
       <w:pPr>
         <w:pStyle w:val="Heading3"/>
@@ -6426,8 +6681,8 @@
         <w:t xml:space="preserve">do not differ systematically during the baseline interval.</w:t>
       </w:r>
     </w:p>
-    <w:bookmarkEnd w:id="72"/>
-    <w:bookmarkStart w:id="73" w:name="model-structure"/>
+    <w:bookmarkEnd w:id="80"/>
+    <w:bookmarkStart w:id="81" w:name="model-structure"/>
     <w:p>
       <w:pPr>
         <w:pStyle w:val="Heading3"/>
@@ -7391,8 +7646,8 @@
         <w:t xml:space="preserve">.</w:t>
       </w:r>
     </w:p>
-    <w:bookmarkEnd w:id="73"/>
-    <w:bookmarkStart w:id="78" w:name="priors"/>
+    <w:bookmarkEnd w:id="81"/>
+    <w:bookmarkStart w:id="86" w:name="priors"/>
     <w:p>
       <w:pPr>
         <w:pStyle w:val="Heading3"/>
@@ -8358,7 +8613,7 @@
           <w:rPr>
             <w:rStyle w:val="Hyperlink"/>
           </w:rPr>
-          <w:t xml:space="preserve">Figure 4</w:t>
+          <w:t xml:space="preserve">Figure 6</w:t>
         </w:r>
       </w:hyperlink>
       <w:r>
@@ -8680,13 +8935,13 @@
         <w:t xml:space="preserve">so its credibility does not depend on them.</w:t>
       </w:r>
     </w:p>
-    <w:bookmarkStart w:id="77" w:name="fig-priorpc"/>
+    <w:bookmarkStart w:id="85" w:name="fig-priorpc"/>
     <w:p>
       <w:pPr>
         <w:pStyle w:val="FigureTitle"/>
       </w:pPr>
       <w:r>
-        <w:t xml:space="preserve">Figure 4</w:t>
+        <w:t xml:space="preserve">Figure 6</w:t>
       </w:r>
     </w:p>
     <w:p>
@@ -8706,18 +8961,18 @@
           <wp:inline>
             <wp:extent cx="4279392" cy="2852928"/>
             <wp:effectExtent b="0" l="0" r="0" t="0"/>
-            <wp:docPr descr="" title="" id="75" name="Picture"/>
+            <wp:docPr descr="" title="" id="83" name="Picture"/>
             <a:graphic>
               <a:graphicData uri="http://schemas.openxmlformats.org/drawingml/2006/picture">
                 <pic:pic>
                   <pic:nvPicPr>
-                    <pic:cNvPr descr="figures/prior_predictive_check.png" id="76" name="Picture"/>
+                    <pic:cNvPr descr="figures/prior_predictive_check.png" id="84" name="Picture"/>
                     <pic:cNvPicPr>
                       <a:picLocks noChangeArrowheads="1" noChangeAspect="1"/>
                     </pic:cNvPicPr>
                   </pic:nvPicPr>
                   <pic:blipFill>
-                    <a:blip r:embed="rId74"/>
+                    <a:blip r:embed="rId82"/>
                     <a:stretch>
                       <a:fillRect/>
                     </a:stretch>
@@ -8744,7 +8999,7 @@
         </w:drawing>
       </w:r>
     </w:p>
-    <w:bookmarkEnd w:id="77"/>
+    <w:bookmarkEnd w:id="85"/>
     <w:p>
       <w:pPr>
         <w:pStyle w:val="FigureNote"/>
@@ -8760,8 +9015,8 @@
         <w:t xml:space="preserve">. The model is subject–verb gender agreement, 400–900 ms midline. Light lines are datasets simulated from the priors alone, with the likelihood switched off, and the dark line is the observed within-participant z-scored single-trial amplitudes. The prior predictive distribution comfortably encompasses the observed data, so the priors are not in conflict with it. The horizontal axis spans the full range of the prior draws, which reach far beyond the observed range. That is the intended behaviour of wide priors on a standardised scale, and it is why the observed density appears compressed near zero. The check therefore establishes that the priors generate data of a plausible order of magnitude, not that they are tightly calibrated to the observed distribution.</w:t>
       </w:r>
     </w:p>
-    <w:bookmarkEnd w:id="78"/>
-    <w:bookmarkStart w:id="79" w:name="sampler-settings-and-convergence"/>
+    <w:bookmarkEnd w:id="86"/>
+    <w:bookmarkStart w:id="87" w:name="sampler-settings-and-convergence"/>
     <w:p>
       <w:pPr>
         <w:pStyle w:val="Heading3"/>
@@ -9068,8 +9323,8 @@
         <w:t xml:space="preserve">borderline.</w:t>
       </w:r>
     </w:p>
-    <w:bookmarkEnd w:id="79"/>
-    <w:bookmarkStart w:id="80" w:name="inference"/>
+    <w:bookmarkEnd w:id="87"/>
+    <w:bookmarkStart w:id="88" w:name="inference"/>
     <w:p>
       <w:pPr>
         <w:pStyle w:val="Heading3"/>
@@ -9352,7 +9607,7 @@
           <w:rPr>
             <w:rStyle w:val="Hyperlink"/>
           </w:rPr>
-          <w:t xml:space="preserve">Figure 5</w:t>
+          <w:t xml:space="preserve">Figure 7</w:t>
         </w:r>
       </w:hyperlink>
       <w:r>
@@ -9542,8 +9797,8 @@
         <w:t xml:space="preserve">).</w:t>
       </w:r>
     </w:p>
-    <w:bookmarkEnd w:id="80"/>
-    <w:bookmarkStart w:id="81" w:name="multivariate-decoding-of-grammaticality"/>
+    <w:bookmarkEnd w:id="88"/>
+    <w:bookmarkStart w:id="89" w:name="multivariate-decoding-of-grammaticality"/>
     <w:p>
       <w:pPr>
         <w:pStyle w:val="Heading3"/>
@@ -10199,9 +10454,9 @@
         <w:t xml:space="preserve">.</w:t>
       </w:r>
     </w:p>
-    <w:bookmarkEnd w:id="81"/>
-    <w:bookmarkEnd w:id="82"/>
-    <w:bookmarkStart w:id="84" w:name="Xa1aa7648d5ac5e7d9e5b3f8be809fb2fcb7ad16"/>
+    <w:bookmarkEnd w:id="89"/>
+    <w:bookmarkEnd w:id="90"/>
+    <w:bookmarkStart w:id="92" w:name="Xa1aa7648d5ac5e7d9e5b3f8be809fb2fcb7ad16"/>
     <w:p>
       <w:pPr>
         <w:pStyle w:val="Heading2"/>
@@ -10223,7 +10478,7 @@
       <w:r>
         <w:t xml:space="preserve">preregistered before data collection (</w:t>
       </w:r>
-      <w:hyperlink r:id="rId83">
+      <w:hyperlink r:id="rId91">
         <w:r>
           <w:rPr>
             <w:rStyle w:val="Hyperlink"/>
@@ -10578,31 +10833,61 @@
         <w:pStyle w:val="BodyText"/>
       </w:pPr>
       <w:r>
-        <w:t xml:space="preserve">Following the preregistered protocol, in each grammar session, participants had to</w:t>
-      </w:r>
-      <w:r>
-        <w:t xml:space="preserve"> </w:t>
-      </w:r>
-      <w:r>
-        <w:t xml:space="preserve">score above 80% on the post-training behavioural test (with a second attempt allowed)</w:t>
-      </w:r>
-      <w:r>
-        <w:t xml:space="preserve"> </w:t>
-      </w:r>
-      <w:r>
-        <w:t xml:space="preserve">before proceeding to the EEG experiment. This performance threshold is both an</w:t>
-      </w:r>
-      <w:r>
-        <w:t xml:space="preserve"> </w:t>
-      </w:r>
-      <w:r>
-        <w:t xml:space="preserve">inclusion criterion and a performance-conditional missingness mechanism, since it</w:t>
-      </w:r>
-      <w:r>
-        <w:t xml:space="preserve"> </w:t>
-      </w:r>
-      <w:r>
-        <w:t xml:space="preserve">conditions which participant-sessions contribute EEG and behaviour. Its effect is</w:t>
+        <w:t xml:space="preserve">The preregistered protocol required participants to score above 80% on the post-training</w:t>
+      </w:r>
+      <w:r>
+        <w:t xml:space="preserve"> </w:t>
+      </w:r>
+      <w:r>
+        <w:t xml:space="preserve">behavioural test in each grammar session before proceeding to the EEG experiment. After</w:t>
+      </w:r>
+      <w:r>
+        <w:t xml:space="preserve"> </w:t>
+      </w:r>
+      <w:r>
+        <w:t xml:space="preserve">a few participants had been tested, we recognised that this criterion was too strict and</w:t>
+      </w:r>
+      <w:r>
+        <w:t xml:space="preserve"> </w:t>
+      </w:r>
+      <w:r>
+        <w:t xml:space="preserve">modified the procedure: when the first test score was below 80%, pretraining, training</w:t>
+      </w:r>
+      <w:r>
+        <w:t xml:space="preserve"> </w:t>
+      </w:r>
+      <w:r>
+        <w:t xml:space="preserve">and the test were repeated; after the second attempt, participants proceeded to the</w:t>
+      </w:r>
+      <w:r>
+        <w:t xml:space="preserve"> </w:t>
+      </w:r>
+      <w:r>
+        <w:t xml:space="preserve">experiment regardless of their score. Participants were shown their percentage correct</w:t>
+      </w:r>
+      <w:r>
+        <w:t xml:space="preserve"> </w:t>
+      </w:r>
+      <w:r>
+        <w:t xml:space="preserve">at the end of each test attempt. The 80% threshold therefore describes the first-attempt</w:t>
+      </w:r>
+      <w:r>
+        <w:t xml:space="preserve"> </w:t>
+      </w:r>
+      <w:r>
+        <w:t xml:space="preserve">gate, not a requirement imposed on the second attempt. This performance threshold is</w:t>
+      </w:r>
+      <w:r>
+        <w:t xml:space="preserve"> </w:t>
+      </w:r>
+      <w:r>
+        <w:t xml:space="preserve">both an inclusion criterion and a performance-conditional missingness mechanism, since</w:t>
+      </w:r>
+      <w:r>
+        <w:t xml:space="preserve"> </w:t>
+      </w:r>
+      <w:r>
+        <w:t xml:space="preserve">it conditions which participant-sessions contribute EEG and behaviour. Its effect is</w:t>
       </w:r>
       <w:r>
         <w:t xml:space="preserve"> </w:t>
@@ -10649,9 +10934,9 @@
         <w:t xml:space="preserve">from it.</w:t>
       </w:r>
     </w:p>
-    <w:bookmarkEnd w:id="84"/>
-    <w:bookmarkEnd w:id="85"/>
-    <w:bookmarkStart w:id="111" w:name="results"/>
+    <w:bookmarkEnd w:id="92"/>
+    <w:bookmarkEnd w:id="93"/>
+    <w:bookmarkStart w:id="119" w:name="results"/>
     <w:p>
       <w:pPr>
         <w:pStyle w:val="Heading1"/>
@@ -10703,7 +10988,7 @@
         <w:t xml:space="preserve">.</w:t>
       </w:r>
     </w:p>
-    <w:bookmarkStart w:id="103" w:name="Xf4fae0881c607eb6863bf9a1bc4ed423905f27f"/>
+    <w:bookmarkStart w:id="111" w:name="Xf4fae0881c607eb6863bf9a1bc4ed423905f27f"/>
     <w:p>
       <w:pPr>
         <w:pStyle w:val="Heading2"/>
@@ -10817,7 +11102,7 @@
           <w:rPr>
             <w:rStyle w:val="Hyperlink"/>
           </w:rPr>
-          <w:t xml:space="preserve">Figure 5</w:t>
+          <w:t xml:space="preserve">Figure 7</w:t>
         </w:r>
       </w:hyperlink>
       <w:r>
@@ -10837,7 +11122,7 @@
           <w:rPr>
             <w:rStyle w:val="Hyperlink"/>
           </w:rPr>
-          <w:t xml:space="preserve">Figure 6</w:t>
+          <w:t xml:space="preserve">Figure 8</w:t>
         </w:r>
       </w:hyperlink>
       <w:r>
@@ -10957,13 +11242,13 @@
         <w:t xml:space="preserve">organised by property.</w:t>
       </w:r>
     </w:p>
-    <w:bookmarkStart w:id="89" w:name="fig-erp-forest"/>
+    <w:bookmarkStart w:id="97" w:name="fig-erp-forest"/>
     <w:p>
       <w:pPr>
         <w:pStyle w:val="FigureTitle"/>
       </w:pPr>
       <w:r>
-        <w:t xml:space="preserve">Figure 5</w:t>
+        <w:t xml:space="preserve">Figure 7</w:t>
       </w:r>
     </w:p>
     <w:p>
@@ -10983,18 +11268,18 @@
           <wp:inline>
             <wp:extent cx="5943600" cy="6400799"/>
             <wp:effectExtent b="0" l="0" r="0" t="0"/>
-            <wp:docPr descr="" title="" id="87" name="Picture"/>
+            <wp:docPr descr="" title="" id="95" name="Picture"/>
             <a:graphic>
               <a:graphicData uri="http://schemas.openxmlformats.org/drawingml/2006/picture">
                 <pic:pic>
                   <pic:nvPicPr>
-                    <pic:cNvPr descr="paper_1_morphosyntax_files/figure-docx/fig-erp-forest-1.png" id="88" name="Picture"/>
+                    <pic:cNvPr descr="paper_1_morphosyntax_files/figure-docx/fig-erp-forest-1.png" id="96" name="Picture"/>
                     <pic:cNvPicPr>
                       <a:picLocks noChangeArrowheads="1" noChangeAspect="1"/>
                     </pic:cNvPicPr>
                   </pic:nvPicPr>
                   <pic:blipFill>
-                    <a:blip r:embed="rId86"/>
+                    <a:blip r:embed="rId94"/>
                     <a:stretch>
                       <a:fillRect/>
                     </a:stretch>
@@ -11021,7 +11306,7 @@
         </w:drawing>
       </w:r>
     </w:p>
-    <w:bookmarkEnd w:id="89"/>
+    <w:bookmarkEnd w:id="97"/>
     <w:p>
       <w:pPr>
         <w:pStyle w:val="FigureNote"/>
@@ -11037,13 +11322,13 @@
         <w:t xml:space="preserve">. Cells are arranged by grammatical property (rows) and term (columns), with each cell’s window and macroregion on the vertical axis. All panels share a common x axis, so effect magnitudes are directly comparable across cells and terms. Filled points mark effects whose 95% interval excludes zero; open points do not. Estimates are in within-participant SD units.</w:t>
       </w:r>
     </w:p>
-    <w:bookmarkStart w:id="93" w:name="fig-erp-waveforms"/>
+    <w:bookmarkStart w:id="101" w:name="fig-erp-waveforms"/>
     <w:p>
       <w:pPr>
         <w:pStyle w:val="FigureTitle"/>
       </w:pPr>
       <w:r>
-        <w:t xml:space="preserve">Figure 6</w:t>
+        <w:t xml:space="preserve">Figure 8</w:t>
       </w:r>
     </w:p>
     <w:p>
@@ -11063,18 +11348,18 @@
           <wp:inline>
             <wp:extent cx="5943600" cy="4572000"/>
             <wp:effectExtent b="0" l="0" r="0" t="0"/>
-            <wp:docPr descr="" title="" id="91" name="Picture"/>
+            <wp:docPr descr="" title="" id="99" name="Picture"/>
             <a:graphic>
               <a:graphicData uri="http://schemas.openxmlformats.org/drawingml/2006/picture">
                 <pic:pic>
                   <pic:nvPicPr>
-                    <pic:cNvPr descr="paper_1_morphosyntax_files/figure-docx/fig-erp-waveforms-1.png" id="92" name="Picture"/>
+                    <pic:cNvPr descr="paper_1_morphosyntax_files/figure-docx/fig-erp-waveforms-1.png" id="100" name="Picture"/>
                     <pic:cNvPicPr>
                       <a:picLocks noChangeArrowheads="1" noChangeAspect="1"/>
                     </pic:cNvPicPr>
                   </pic:nvPicPr>
                   <pic:blipFill>
-                    <a:blip r:embed="rId90"/>
+                    <a:blip r:embed="rId98"/>
                     <a:stretch>
                       <a:fillRect/>
                     </a:stretch>
@@ -11101,7 +11386,7 @@
         </w:drawing>
       </w:r>
     </w:p>
-    <w:bookmarkEnd w:id="93"/>
+    <w:bookmarkEnd w:id="101"/>
     <w:p>
       <w:pPr>
         <w:pStyle w:val="FigureNote"/>
@@ -11134,7 +11419,7 @@
         <w:t xml:space="preserve">to 0 ms) is shaded. The vertical axis is scaled separately for the two sites. The waveforms are not baseline-corrected (the single-trial models use each trial’s own pre-stimulus baseline). The three a priori analysis windows (200–500, 300–600 and 400–900 ms) are shaded. They overlap by design, because the underlying components do, so the depth of shading reflects window overlap and does not mark out any one window. These are descriptive condition averages with no uncertainty band, and the inferential statements come from the models in the forest plot. Unlike those models, they are computed on the full sample, including the four mis-filtered Session-3 datasets described in the Method.</w:t>
       </w:r>
     </w:p>
-    <w:bookmarkStart w:id="94" w:name="subjectverb-gender-agreement"/>
+    <w:bookmarkStart w:id="102" w:name="subjectverb-gender-agreement"/>
     <w:p>
       <w:pPr>
         <w:pStyle w:val="Heading3"/>
@@ -11190,7 +11475,7 @@
           <w:rPr>
             <w:rStyle w:val="Hyperlink"/>
           </w:rPr>
-          <w:t xml:space="preserve">Figure 5</w:t>
+          <w:t xml:space="preserve">Figure 7</w:t>
         </w:r>
       </w:hyperlink>
       <w:r>
@@ -11722,8 +12007,8 @@
         <w:t xml:space="preserve">).</w:t>
       </w:r>
     </w:p>
-    <w:bookmarkEnd w:id="94"/>
-    <w:bookmarkStart w:id="95" w:name="differential-object-marking"/>
+    <w:bookmarkEnd w:id="102"/>
+    <w:bookmarkStart w:id="103" w:name="differential-object-marking"/>
     <w:p>
       <w:pPr>
         <w:pStyle w:val="Heading3"/>
@@ -11762,7 +12047,7 @@
           <w:rPr>
             <w:rStyle w:val="Hyperlink"/>
           </w:rPr>
-          <w:t xml:space="preserve">Figure 5</w:t>
+          <w:t xml:space="preserve">Figure 7</w:t>
         </w:r>
       </w:hyperlink>
       <w:r>
@@ -12563,8 +12848,8 @@
         <w:t xml:space="preserve">in direction as well as in magnitude.</w:t>
       </w:r>
     </w:p>
-    <w:bookmarkEnd w:id="95"/>
-    <w:bookmarkStart w:id="96" w:name="verbobject-number-agreement"/>
+    <w:bookmarkEnd w:id="103"/>
+    <w:bookmarkStart w:id="104" w:name="verbobject-number-agreement"/>
     <w:p>
       <w:pPr>
         <w:pStyle w:val="Heading3"/>
@@ -12591,7 +12876,7 @@
           <w:rPr>
             <w:rStyle w:val="Hyperlink"/>
           </w:rPr>
-          <w:t xml:space="preserve">Figure 5</w:t>
+          <w:t xml:space="preserve">Figure 7</w:t>
         </w:r>
       </w:hyperlink>
       <w:r>
@@ -13045,8 +13330,8 @@
         <w:t xml:space="preserve">unaltered here. We read them accordingly throughout.</w:t>
       </w:r>
     </w:p>
-    <w:bookmarkEnd w:id="96"/>
-    <w:bookmarkStart w:id="101" w:name="topography"/>
+    <w:bookmarkEnd w:id="104"/>
+    <w:bookmarkStart w:id="109" w:name="topography"/>
     <w:p>
       <w:pPr>
         <w:pStyle w:val="Heading3"/>
@@ -13277,20 +13562,20 @@
           <w:rPr>
             <w:rStyle w:val="Hyperlink"/>
           </w:rPr>
-          <w:t xml:space="preserve">Figure 7</w:t>
+          <w:t xml:space="preserve">Figure 9</w:t>
         </w:r>
       </w:hyperlink>
       <w:r>
         <w:t xml:space="preserve">).</w:t>
       </w:r>
     </w:p>
-    <w:bookmarkStart w:id="100" w:name="fig-erp-topography"/>
+    <w:bookmarkStart w:id="108" w:name="fig-erp-topography"/>
     <w:p>
       <w:pPr>
         <w:pStyle w:val="FigureTitle"/>
       </w:pPr>
       <w:r>
-        <w:t xml:space="preserve">Figure 7</w:t>
+        <w:t xml:space="preserve">Figure 9</w:t>
       </w:r>
     </w:p>
     <w:p>
@@ -13310,18 +13595,18 @@
           <wp:inline>
             <wp:extent cx="5943600" cy="1920239"/>
             <wp:effectExtent b="0" l="0" r="0" t="0"/>
-            <wp:docPr descr="" title="" id="98" name="Picture"/>
+            <wp:docPr descr="" title="" id="106" name="Picture"/>
             <a:graphic>
               <a:graphicData uri="http://schemas.openxmlformats.org/drawingml/2006/picture">
                 <pic:pic>
                   <pic:nvPicPr>
-                    <pic:cNvPr descr="paper_1_morphosyntax_files/figure-docx/fig-erp-topography-1.png" id="99" name="Picture"/>
+                    <pic:cNvPr descr="paper_1_morphosyntax_files/figure-docx/fig-erp-topography-1.png" id="107" name="Picture"/>
                     <pic:cNvPicPr>
                       <a:picLocks noChangeArrowheads="1" noChangeAspect="1"/>
                     </pic:cNvPicPr>
                   </pic:nvPicPr>
                   <pic:blipFill>
-                    <a:blip r:embed="rId97"/>
+                    <a:blip r:embed="rId105"/>
                     <a:stretch>
                       <a:fillRect/>
                     </a:stretch>
@@ -13348,7 +13633,7 @@
         </w:drawing>
       </w:r>
     </w:p>
-    <w:bookmarkEnd w:id="100"/>
+    <w:bookmarkEnd w:id="108"/>
     <w:p>
       <w:pPr>
         <w:pStyle w:val="FigureNote"/>
@@ -13364,8 +13649,8 @@
         <w:t xml:space="preserve">. The topography is the grammatical minus ungrammatical mean amplitude, averaged over all retained trials and so weighted by each participant’s retained-trial count, with no baseline correction. As with the waveforms, the average is taken over the full sample, including the four mis-filtered Session-3 datasets that the models exclude. The field is interpolated by thin-plate spline across the 30 electrodes assigned to the analysis regions (dots; nose at the top) and masked to the head, so no value is shown for scalp the montage did not sample. Sensor positions are the study’s own recorded montage, read from the BrainVision headers. The outline marks the equator, and ears are drawn for orientation. The two low-temporal sites that sit below the equator (FT9/FT10) therefore fall outside the outline and are drawn as open circles. They inform the interpolation at the rim but no value is plotted beyond the equator. Warmer values indicate a larger grammatical-trial amplitude. The colour scale is symmetric about zero and shared across properties, and the grey line is the zero contour, so the sign of a region can be read without the colour. The distribution is diffuse and not posterior-maximal, consistent with the model-based grammaticality-by-caudality interaction not being credible for any property in this window (see main text).</w:t>
       </w:r>
     </w:p>
-    <w:bookmarkEnd w:id="101"/>
-    <w:bookmarkStart w:id="102" w:name="Xe4d5742d97dcf9f59157263b922c3ef33c8672d"/>
+    <w:bookmarkEnd w:id="109"/>
+    <w:bookmarkStart w:id="110" w:name="Xe4d5742d97dcf9f59157263b922c3ef33c8672d"/>
     <w:p>
       <w:pPr>
         <w:pStyle w:val="Heading3"/>
@@ -13450,9 +13735,9 @@
         <w:t xml:space="preserve">.</w:t>
       </w:r>
     </w:p>
-    <w:bookmarkEnd w:id="102"/>
-    <w:bookmarkEnd w:id="103"/>
-    <w:bookmarkStart w:id="104" w:name="retention-session-4-to-session-6"/>
+    <w:bookmarkEnd w:id="110"/>
+    <w:bookmarkEnd w:id="111"/>
+    <w:bookmarkStart w:id="112" w:name="retention-session-4-to-session-6"/>
     <w:p>
       <w:pPr>
         <w:pStyle w:val="Heading2"/>
@@ -14334,8 +14619,8 @@
         <w:t xml:space="preserve">with the Mini-Norwegian contrasts not credible in either.</w:t>
       </w:r>
     </w:p>
-    <w:bookmarkEnd w:id="104"/>
-    <w:bookmarkStart w:id="105" w:name="judgement-accuracy"/>
+    <w:bookmarkEnd w:id="112"/>
+    <w:bookmarkStart w:id="113" w:name="judgement-accuracy"/>
     <w:p>
       <w:pPr>
         <w:pStyle w:val="Heading2"/>
@@ -15776,8 +16061,8 @@
         <w:t xml:space="preserve">).</w:t>
       </w:r>
     </w:p>
-    <w:bookmarkEnd w:id="105"/>
-    <w:bookmarkStart w:id="110" w:name="X73cfc9f61bbd58eea69c4c192b93eda5b8ec668"/>
+    <w:bookmarkEnd w:id="113"/>
+    <w:bookmarkStart w:id="118" w:name="X73cfc9f61bbd58eea69c4c192b93eda5b8ec668"/>
     <w:p>
       <w:pPr>
         <w:pStyle w:val="Heading2"/>
@@ -15813,7 +16098,7 @@
           <w:rPr>
             <w:rStyle w:val="Hyperlink"/>
           </w:rPr>
-          <w:t xml:space="preserve">Figure 8</w:t>
+          <w:t xml:space="preserve">Figure 10</w:t>
         </w:r>
       </w:hyperlink>
       <w:r>
@@ -15906,13 +16191,13 @@
         <w:t xml:space="preserve"> </w:t>
       </w:r>
     </w:p>
-    <w:bookmarkStart w:id="109" w:name="fig-decoding"/>
+    <w:bookmarkStart w:id="117" w:name="fig-decoding"/>
     <w:p>
       <w:pPr>
         <w:pStyle w:val="FigureTitle"/>
       </w:pPr>
       <w:r>
-        <w:t xml:space="preserve">Figure 8</w:t>
+        <w:t xml:space="preserve">Figure 10</w:t>
       </w:r>
     </w:p>
     <w:p>
@@ -15932,18 +16217,18 @@
           <wp:inline>
             <wp:extent cx="5943600" cy="4754879"/>
             <wp:effectExtent b="0" l="0" r="0" t="0"/>
-            <wp:docPr descr="" title="" id="107" name="Picture"/>
+            <wp:docPr descr="" title="" id="115" name="Picture"/>
             <a:graphic>
               <a:graphicData uri="http://schemas.openxmlformats.org/drawingml/2006/picture">
                 <pic:pic>
                   <pic:nvPicPr>
-                    <pic:cNvPr descr="paper_1_morphosyntax_files/figure-docx/fig-decoding-1.png" id="108" name="Picture"/>
+                    <pic:cNvPr descr="paper_1_morphosyntax_files/figure-docx/fig-decoding-1.png" id="116" name="Picture"/>
                     <pic:cNvPicPr>
                       <a:picLocks noChangeArrowheads="1" noChangeAspect="1"/>
                     </pic:cNvPicPr>
                   </pic:nvPicPr>
                   <pic:blipFill>
-                    <a:blip r:embed="rId106"/>
+                    <a:blip r:embed="rId114"/>
                     <a:stretch>
                       <a:fillRect/>
                     </a:stretch>
@@ -15970,7 +16255,7 @@
         </w:drawing>
       </w:r>
     </w:p>
-    <w:bookmarkEnd w:id="109"/>
+    <w:bookmarkEnd w:id="117"/>
     <w:p>
       <w:pPr>
         <w:pStyle w:val="FigureNote"/>
@@ -16037,7 +16322,7 @@
           <w:rPr>
             <w:rStyle w:val="Hyperlink"/>
           </w:rPr>
-          <w:t xml:space="preserve">Figure 8</w:t>
+          <w:t xml:space="preserve">Figure 10</w:t>
         </w:r>
       </w:hyperlink>
       <w:r>
@@ -16174,7 +16459,7 @@
           <w:rPr>
             <w:rStyle w:val="Hyperlink"/>
           </w:rPr>
-          <w:t xml:space="preserve">Figure 8</w:t>
+          <w:t xml:space="preserve">Figure 10</w:t>
         </w:r>
       </w:hyperlink>
       <w:r>
@@ -16403,9 +16688,9 @@
         <w:t xml:space="preserve">.</w:t>
       </w:r>
     </w:p>
-    <w:bookmarkEnd w:id="110"/>
-    <w:bookmarkEnd w:id="111"/>
-    <w:bookmarkStart w:id="120" w:name="discussion"/>
+    <w:bookmarkEnd w:id="118"/>
+    <w:bookmarkEnd w:id="119"/>
+    <w:bookmarkStart w:id="128" w:name="discussion"/>
     <w:p>
       <w:pPr>
         <w:pStyle w:val="Heading1"/>
@@ -16491,7 +16776,7 @@
           <w:rPr>
             <w:rStyle w:val="Hyperlink"/>
           </w:rPr>
-          <w:t xml:space="preserve">Figure 5</w:t>
+          <w:t xml:space="preserve">Figure 7</w:t>
         </w:r>
       </w:hyperlink>
       <w:r>
@@ -16956,7 +17241,7 @@
         <w:t xml:space="preserve">responders, and need not imply a single non-canonical generator.</w:t>
       </w:r>
     </w:p>
-    <w:bookmarkStart w:id="112" w:name="X85c70bee77a7b55d5c51c1262c06b9ac3bceb47"/>
+    <w:bookmarkStart w:id="120" w:name="X85c70bee77a7b55d5c51c1262c06b9ac3bceb47"/>
     <w:p>
       <w:pPr>
         <w:pStyle w:val="Heading2"/>
@@ -17261,8 +17546,8 @@
         <w:t xml:space="preserve">cells, and the Strength of evidence section holds them to that standard.</w:t>
       </w:r>
     </w:p>
-    <w:bookmarkEnd w:id="112"/>
-    <w:bookmarkStart w:id="113" w:name="Xd94c71ec54ed989eb7f93138df1e8e9795fd7f8"/>
+    <w:bookmarkEnd w:id="120"/>
+    <w:bookmarkStart w:id="121" w:name="Xd94c71ec54ed989eb7f93138df1e8e9795fd7f8"/>
     <w:p>
       <w:pPr>
         <w:pStyle w:val="Heading2"/>
@@ -18248,8 +18533,8 @@
         <w:t xml:space="preserve">which the family’s members differ, without treating it as a resolved contrast.</w:t>
       </w:r>
     </w:p>
-    <w:bookmarkEnd w:id="113"/>
-    <w:bookmarkStart w:id="114" w:name="change-across-the-retention-interval"/>
+    <w:bookmarkEnd w:id="121"/>
+    <w:bookmarkStart w:id="122" w:name="change-across-the-retention-interval"/>
     <w:p>
       <w:pPr>
         <w:pStyle w:val="Heading2"/>
@@ -19332,8 +19617,8 @@
         <w:t xml:space="preserve">measured interval may reach past without contradicting.</w:t>
       </w:r>
     </w:p>
-    <w:bookmarkEnd w:id="114"/>
-    <w:bookmarkStart w:id="115" w:name="Xc8f859ce1cc6b29ebc69912ddafa264c24aab2f"/>
+    <w:bookmarkEnd w:id="122"/>
+    <w:bookmarkStart w:id="123" w:name="Xc8f859ce1cc6b29ebc69912ddafa264c24aab2f"/>
     <w:p>
       <w:pPr>
         <w:pStyle w:val="Heading2"/>
@@ -19594,8 +19879,8 @@
         <w:t xml:space="preserve">separate these.</w:t>
       </w:r>
     </w:p>
-    <w:bookmarkEnd w:id="115"/>
-    <w:bookmarkStart w:id="116" w:name="what-the-multivariate-analysis-adds"/>
+    <w:bookmarkEnd w:id="123"/>
+    <w:bookmarkStart w:id="124" w:name="what-the-multivariate-analysis-adds"/>
     <w:p>
       <w:pPr>
         <w:pStyle w:val="Heading2"/>
@@ -20416,8 +20701,8 @@
         <w:t xml:space="preserve">.</w:t>
       </w:r>
     </w:p>
-    <w:bookmarkEnd w:id="116"/>
-    <w:bookmarkStart w:id="117" w:name="strength-of-evidence"/>
+    <w:bookmarkEnd w:id="124"/>
+    <w:bookmarkStart w:id="125" w:name="strength-of-evidence"/>
     <w:p>
       <w:pPr>
         <w:pStyle w:val="Heading2"/>
@@ -20820,8 +21105,8 @@
         <w:t xml:space="preserve">.</w:t>
       </w:r>
     </w:p>
-    <w:bookmarkEnd w:id="117"/>
-    <w:bookmarkStart w:id="118" w:name="limitations-and-future-directions"/>
+    <w:bookmarkEnd w:id="125"/>
+    <w:bookmarkStart w:id="126" w:name="limitations-and-future-directions"/>
     <w:p>
       <w:pPr>
         <w:pStyle w:val="Heading2"/>
@@ -21295,8 +21580,8 @@
         <w:t xml:space="preserve">here.</w:t>
       </w:r>
     </w:p>
-    <w:bookmarkEnd w:id="118"/>
-    <w:bookmarkStart w:id="119" w:name="conclusion"/>
+    <w:bookmarkEnd w:id="126"/>
+    <w:bookmarkStart w:id="127" w:name="conclusion"/>
     <w:p>
       <w:pPr>
         <w:pStyle w:val="Heading2"/>
@@ -21355,9 +21640,9 @@
         <w:t xml:space="preserve">disfavoured more by the advantage’s growth over sessions than by its location.</w:t>
       </w:r>
     </w:p>
-    <w:bookmarkEnd w:id="119"/>
-    <w:bookmarkEnd w:id="120"/>
-    <w:bookmarkStart w:id="123" w:name="data-and-code-availability"/>
+    <w:bookmarkEnd w:id="127"/>
+    <w:bookmarkEnd w:id="128"/>
+    <w:bookmarkStart w:id="131" w:name="data-and-code-availability"/>
     <w:p>
       <w:pPr>
         <w:pStyle w:val="Heading1"/>
@@ -21731,7 +22016,7 @@
       <w:r>
         <w:t xml:space="preserve"> </w:t>
       </w:r>
-      <w:hyperlink r:id="rId121">
+      <w:hyperlink r:id="rId129">
         <w:r>
           <w:rPr>
             <w:rStyle w:val="Hyperlink"/>
@@ -21820,7 +22105,7 @@
       <w:r>
         <w:t xml:space="preserve"> </w:t>
       </w:r>
-      <w:hyperlink r:id="rId122">
+      <w:hyperlink r:id="rId130">
         <w:r>
           <w:rPr>
             <w:rStyle w:val="Hyperlink"/>
@@ -21832,8 +22117,8 @@
         <w:t xml:space="preserve">.</w:t>
       </w:r>
     </w:p>
-    <w:bookmarkEnd w:id="123"/>
-    <w:bookmarkStart w:id="124" w:name="X1f74eb43af444059c7518034463b6c89b1cacf4"/>
+    <w:bookmarkEnd w:id="131"/>
+    <w:bookmarkStart w:id="132" w:name="X1f74eb43af444059c7518034463b6c89b1cacf4"/>
     <w:p>
       <w:pPr>
         <w:pStyle w:val="Heading1"/>
@@ -21874,8 +22159,8 @@
         <w:t xml:space="preserve">of the published article.</w:t>
       </w:r>
     </w:p>
-    <w:bookmarkEnd w:id="124"/>
-    <w:bookmarkStart w:id="125" w:name="credit-authorship-contribution-statement"/>
+    <w:bookmarkEnd w:id="132"/>
+    <w:bookmarkStart w:id="133" w:name="credit-authorship-contribution-statement"/>
     <w:p>
       <w:pPr>
         <w:pStyle w:val="Heading1"/>
@@ -22064,8 +22349,8 @@
         <w:t xml:space="preserve">Funding acquisition, Project administration, Supervision, Writing – review &amp; editing.</w:t>
       </w:r>
     </w:p>
-    <w:bookmarkEnd w:id="125"/>
-    <w:bookmarkStart w:id="126" w:name="funding"/>
+    <w:bookmarkEnd w:id="133"/>
+    <w:bookmarkStart w:id="134" w:name="funding"/>
     <w:p>
       <w:pPr>
         <w:pStyle w:val="Heading1"/>
@@ -22088,8 +22373,8 @@
         <w:t xml:space="preserve">by the Comunidad de Madrid (grant 2020-T1/HUM-20037), both awarded to Jorge González Alonso.</w:t>
       </w:r>
     </w:p>
-    <w:bookmarkEnd w:id="126"/>
-    <w:bookmarkStart w:id="127" w:name="declaration-of-competing-interest"/>
+    <w:bookmarkEnd w:id="134"/>
+    <w:bookmarkStart w:id="135" w:name="declaration-of-competing-interest"/>
     <w:p>
       <w:pPr>
         <w:pStyle w:val="Heading1"/>
@@ -22112,8 +22397,8 @@
         <w:t xml:space="preserve">relationships that could have appeared to influence the work reported in this paper.</w:t>
       </w:r>
     </w:p>
-    <w:bookmarkEnd w:id="127"/>
-    <w:bookmarkStart w:id="128" w:name="acknowledgements"/>
+    <w:bookmarkEnd w:id="135"/>
+    <w:bookmarkStart w:id="136" w:name="acknowledgements"/>
     <w:p>
       <w:pPr>
         <w:pStyle w:val="Heading1"/>
@@ -22188,7 +22473,7 @@
         <w:br w:type="page"/>
       </w:r>
     </w:p>
-    <w:bookmarkEnd w:id="128"/>
+    <w:bookmarkEnd w:id="136"/>
     <w:p>
       <w:pPr>
         <w:pStyle w:val="Heading1"/>
@@ -22197,8 +22482,8 @@
         <w:t xml:space="preserve">References</w:t>
       </w:r>
     </w:p>
-    <w:bookmarkStart w:id="384" w:name="refs"/>
-    <w:bookmarkStart w:id="130" w:name="ref-ahlfors2010"/>
+    <w:bookmarkStart w:id="392" w:name="refs"/>
+    <w:bookmarkStart w:id="138" w:name="ref-ahlfors2010"/>
     <w:p>
       <w:pPr>
         <w:pStyle w:val="Bibliography"/>
@@ -22259,7 +22544,7 @@
       <w:r>
         <w:t xml:space="preserve"> </w:t>
       </w:r>
-      <w:hyperlink r:id="rId129">
+      <w:hyperlink r:id="rId137">
         <w:r>
           <w:rPr>
             <w:rStyle w:val="Hyperlink"/>
@@ -22268,8 +22553,8 @@
         </w:r>
       </w:hyperlink>
     </w:p>
-    <w:bookmarkEnd w:id="130"/>
-    <w:bookmarkStart w:id="132" w:name="ref-alday2019"/>
+    <w:bookmarkEnd w:id="138"/>
+    <w:bookmarkStart w:id="140" w:name="ref-alday2019"/>
     <w:p>
       <w:pPr>
         <w:pStyle w:val="Bibliography"/>
@@ -22330,7 +22615,7 @@
       <w:r>
         <w:t xml:space="preserve"> </w:t>
       </w:r>
-      <w:hyperlink r:id="rId131">
+      <w:hyperlink r:id="rId139">
         <w:r>
           <w:rPr>
             <w:rStyle w:val="Hyperlink"/>
@@ -22339,8 +22624,8 @@
         </w:r>
       </w:hyperlink>
     </w:p>
-    <w:bookmarkEnd w:id="132"/>
-    <w:bookmarkStart w:id="134" w:name="ref-alemanbanon2018"/>
+    <w:bookmarkEnd w:id="140"/>
+    <w:bookmarkStart w:id="142" w:name="ref-alemanbanon2018"/>
     <w:p>
       <w:pPr>
         <w:pStyle w:val="Bibliography"/>
@@ -22386,7 +22671,7 @@
       <w:r>
         <w:t xml:space="preserve"> </w:t>
       </w:r>
-      <w:hyperlink r:id="rId133">
+      <w:hyperlink r:id="rId141">
         <w:r>
           <w:rPr>
             <w:rStyle w:val="Hyperlink"/>
@@ -22395,8 +22680,8 @@
         </w:r>
       </w:hyperlink>
     </w:p>
-    <w:bookmarkEnd w:id="134"/>
-    <w:bookmarkStart w:id="136" w:name="ref-allefeld2016"/>
+    <w:bookmarkEnd w:id="142"/>
+    <w:bookmarkStart w:id="144" w:name="ref-allefeld2016"/>
     <w:p>
       <w:pPr>
         <w:pStyle w:val="Bibliography"/>
@@ -22433,7 +22718,7 @@
       <w:r>
         <w:t xml:space="preserve"> </w:t>
       </w:r>
-      <w:hyperlink r:id="rId135">
+      <w:hyperlink r:id="rId143">
         <w:r>
           <w:rPr>
             <w:rStyle w:val="Hyperlink"/>
@@ -22442,8 +22727,8 @@
         </w:r>
       </w:hyperlink>
     </w:p>
-    <w:bookmarkEnd w:id="136"/>
-    <w:bookmarkStart w:id="138" w:name="ref-gonzalezalonso2026"/>
+    <w:bookmarkEnd w:id="144"/>
+    <w:bookmarkStart w:id="146" w:name="ref-gonzalezalonso2026"/>
     <w:p>
       <w:pPr>
         <w:pStyle w:val="Bibliography"/>
@@ -22470,7 +22755,7 @@
       <w:r>
         <w:t xml:space="preserve"> </w:t>
       </w:r>
-      <w:hyperlink r:id="rId137">
+      <w:hyperlink r:id="rId145">
         <w:r>
           <w:rPr>
             <w:rStyle w:val="Hyperlink"/>
@@ -22479,8 +22764,8 @@
         </w:r>
       </w:hyperlink>
     </w:p>
-    <w:bookmarkEnd w:id="138"/>
-    <w:bookmarkStart w:id="140" w:name="ref-gonzalezalonso2017"/>
+    <w:bookmarkEnd w:id="146"/>
+    <w:bookmarkStart w:id="148" w:name="ref-gonzalezalonso2017"/>
     <w:p>
       <w:pPr>
         <w:pStyle w:val="Bibliography"/>
@@ -22529,7 +22814,7 @@
       <w:r>
         <w:t xml:space="preserve"> </w:t>
       </w:r>
-      <w:hyperlink r:id="rId139">
+      <w:hyperlink r:id="rId147">
         <w:r>
           <w:rPr>
             <w:rStyle w:val="Hyperlink"/>
@@ -22538,8 +22823,8 @@
         </w:r>
       </w:hyperlink>
     </w:p>
-    <w:bookmarkEnd w:id="140"/>
-    <w:bookmarkStart w:id="142" w:name="ref-amrhein2019"/>
+    <w:bookmarkEnd w:id="148"/>
+    <w:bookmarkStart w:id="150" w:name="ref-amrhein2019"/>
     <w:p>
       <w:pPr>
         <w:pStyle w:val="Bibliography"/>
@@ -22576,7 +22861,7 @@
       <w:r>
         <w:t xml:space="preserve"> </w:t>
       </w:r>
-      <w:hyperlink r:id="rId141">
+      <w:hyperlink r:id="rId149">
         <w:r>
           <w:rPr>
             <w:rStyle w:val="Hyperlink"/>
@@ -22585,8 +22870,8 @@
         </w:r>
       </w:hyperlink>
     </w:p>
-    <w:bookmarkEnd w:id="142"/>
-    <w:bookmarkStart w:id="144" w:name="ref-angelovska2023"/>
+    <w:bookmarkEnd w:id="150"/>
+    <w:bookmarkStart w:id="152" w:name="ref-angelovska2023"/>
     <w:p>
       <w:pPr>
         <w:pStyle w:val="Bibliography"/>
@@ -22623,7 +22908,7 @@
       <w:r>
         <w:t xml:space="preserve"> </w:t>
       </w:r>
-      <w:hyperlink r:id="rId143">
+      <w:hyperlink r:id="rId151">
         <w:r>
           <w:rPr>
             <w:rStyle w:val="Hyperlink"/>
@@ -22632,8 +22917,8 @@
         </w:r>
       </w:hyperlink>
     </w:p>
-    <w:bookmarkEnd w:id="144"/>
-    <w:bookmarkStart w:id="146" w:name="ref-aurnhammer2023"/>
+    <w:bookmarkEnd w:id="152"/>
+    <w:bookmarkStart w:id="154" w:name="ref-aurnhammer2023"/>
     <w:p>
       <w:pPr>
         <w:pStyle w:val="Bibliography"/>
@@ -22682,7 +22967,7 @@
       <w:r>
         <w:t xml:space="preserve"> </w:t>
       </w:r>
-      <w:hyperlink r:id="rId145">
+      <w:hyperlink r:id="rId153">
         <w:r>
           <w:rPr>
             <w:rStyle w:val="Hyperlink"/>
@@ -22691,8 +22976,8 @@
         </w:r>
       </w:hyperlink>
     </w:p>
-    <w:bookmarkEnd w:id="146"/>
-    <w:bookmarkStart w:id="148" w:name="ref-baayen2008"/>
+    <w:bookmarkEnd w:id="154"/>
+    <w:bookmarkStart w:id="156" w:name="ref-baayen2008"/>
     <w:p>
       <w:pPr>
         <w:pStyle w:val="Bibliography"/>
@@ -22729,7 +23014,7 @@
       <w:r>
         <w:t xml:space="preserve"> </w:t>
       </w:r>
-      <w:hyperlink r:id="rId147">
+      <w:hyperlink r:id="rId155">
         <w:r>
           <w:rPr>
             <w:rStyle w:val="Hyperlink"/>
@@ -22738,8 +23023,8 @@
         </w:r>
       </w:hyperlink>
     </w:p>
-    <w:bookmarkEnd w:id="148"/>
-    <w:bookmarkStart w:id="150" w:name="ref-bakker2015"/>
+    <w:bookmarkEnd w:id="156"/>
+    <w:bookmarkStart w:id="158" w:name="ref-bakker2015"/>
     <w:p>
       <w:pPr>
         <w:pStyle w:val="Bibliography"/>
@@ -22809,7 +23094,7 @@
       <w:r>
         <w:t xml:space="preserve"> </w:t>
       </w:r>
-      <w:hyperlink r:id="rId149">
+      <w:hyperlink r:id="rId157">
         <w:r>
           <w:rPr>
             <w:rStyle w:val="Hyperlink"/>
@@ -22818,8 +23103,8 @@
         </w:r>
       </w:hyperlink>
     </w:p>
-    <w:bookmarkEnd w:id="150"/>
-    <w:bookmarkStart w:id="152" w:name="ref-bardel2007"/>
+    <w:bookmarkEnd w:id="158"/>
+    <w:bookmarkStart w:id="160" w:name="ref-bardel2007"/>
     <w:p>
       <w:pPr>
         <w:pStyle w:val="Bibliography"/>
@@ -22871,7 +23156,7 @@
       <w:r>
         <w:t xml:space="preserve"> </w:t>
       </w:r>
-      <w:hyperlink r:id="rId151">
+      <w:hyperlink r:id="rId159">
         <w:r>
           <w:rPr>
             <w:rStyle w:val="Hyperlink"/>
@@ -22880,8 +23165,8 @@
         </w:r>
       </w:hyperlink>
     </w:p>
-    <w:bookmarkEnd w:id="152"/>
-    <w:bookmarkStart w:id="154" w:name="ref-barr2013"/>
+    <w:bookmarkEnd w:id="160"/>
+    <w:bookmarkStart w:id="162" w:name="ref-barr2013"/>
     <w:p>
       <w:pPr>
         <w:pStyle w:val="Bibliography"/>
@@ -22918,7 +23203,7 @@
       <w:r>
         <w:t xml:space="preserve"> </w:t>
       </w:r>
-      <w:hyperlink r:id="rId153">
+      <w:hyperlink r:id="rId161">
         <w:r>
           <w:rPr>
             <w:rStyle w:val="Hyperlink"/>
@@ -22927,8 +23212,8 @@
         </w:r>
       </w:hyperlink>
     </w:p>
-    <w:bookmarkEnd w:id="154"/>
-    <w:bookmarkStart w:id="156" w:name="ref-depictr"/>
+    <w:bookmarkEnd w:id="162"/>
+    <w:bookmarkStart w:id="164" w:name="ref-depictr"/>
     <w:p>
       <w:pPr>
         <w:pStyle w:val="Bibliography"/>
@@ -22962,7 +23247,7 @@
       <w:r>
         <w:t xml:space="preserve"> </w:t>
       </w:r>
-      <w:hyperlink r:id="rId155">
+      <w:hyperlink r:id="rId163">
         <w:r>
           <w:rPr>
             <w:rStyle w:val="Hyperlink"/>
@@ -22971,8 +23256,8 @@
         </w:r>
       </w:hyperlink>
     </w:p>
-    <w:bookmarkEnd w:id="156"/>
-    <w:bookmarkStart w:id="158" w:name="ref-scopusflow"/>
+    <w:bookmarkEnd w:id="164"/>
+    <w:bookmarkStart w:id="166" w:name="ref-scopusflow"/>
     <w:p>
       <w:pPr>
         <w:pStyle w:val="Bibliography"/>
@@ -23017,7 +23302,7 @@
       <w:r>
         <w:t xml:space="preserve"> </w:t>
       </w:r>
-      <w:hyperlink r:id="rId157">
+      <w:hyperlink r:id="rId165">
         <w:r>
           <w:rPr>
             <w:rStyle w:val="Hyperlink"/>
@@ -23026,8 +23311,8 @@
         </w:r>
       </w:hyperlink>
     </w:p>
-    <w:bookmarkEnd w:id="158"/>
-    <w:bookmarkStart w:id="159" w:name="ref-lesspredictors2026"/>
+    <w:bookmarkEnd w:id="166"/>
+    <w:bookmarkStart w:id="167" w:name="ref-lesspredictors2026"/>
     <w:p>
       <w:pPr>
         <w:pStyle w:val="Bibliography"/>
@@ -23108,8 +23393,8 @@
         <w:t xml:space="preserve">[Manuscript submitted for publication].</w:t>
       </w:r>
     </w:p>
-    <w:bookmarkEnd w:id="159"/>
-    <w:bookmarkStart w:id="161" w:name="ref-brauer2018"/>
+    <w:bookmarkEnd w:id="167"/>
+    <w:bookmarkStart w:id="169" w:name="ref-brauer2018"/>
     <w:p>
       <w:pPr>
         <w:pStyle w:val="Bibliography"/>
@@ -23146,7 +23431,7 @@
       <w:r>
         <w:t xml:space="preserve"> </w:t>
       </w:r>
-      <w:hyperlink r:id="rId160">
+      <w:hyperlink r:id="rId168">
         <w:r>
           <w:rPr>
             <w:rStyle w:val="Hyperlink"/>
@@ -23155,8 +23440,8 @@
         </w:r>
       </w:hyperlink>
     </w:p>
-    <w:bookmarkEnd w:id="161"/>
-    <w:bookmarkStart w:id="163" w:name="ref-burkner2017"/>
+    <w:bookmarkEnd w:id="169"/>
+    <w:bookmarkStart w:id="171" w:name="ref-burkner2017"/>
     <w:p>
       <w:pPr>
         <w:pStyle w:val="Bibliography"/>
@@ -23235,7 +23520,7 @@
       <w:r>
         <w:t xml:space="preserve"> </w:t>
       </w:r>
-      <w:hyperlink r:id="rId162">
+      <w:hyperlink r:id="rId170">
         <w:r>
           <w:rPr>
             <w:rStyle w:val="Hyperlink"/>
@@ -23244,8 +23529,8 @@
         </w:r>
       </w:hyperlink>
     </w:p>
-    <w:bookmarkEnd w:id="163"/>
-    <w:bookmarkStart w:id="165" w:name="ref-burkner2018"/>
+    <w:bookmarkEnd w:id="171"/>
+    <w:bookmarkStart w:id="173" w:name="ref-burkner2018"/>
     <w:p>
       <w:pPr>
         <w:pStyle w:val="Bibliography"/>
@@ -23315,7 +23600,7 @@
       <w:r>
         <w:t xml:space="preserve"> </w:t>
       </w:r>
-      <w:hyperlink r:id="rId164">
+      <w:hyperlink r:id="rId172">
         <w:r>
           <w:rPr>
             <w:rStyle w:val="Hyperlink"/>
@@ -23324,8 +23609,8 @@
         </w:r>
       </w:hyperlink>
     </w:p>
-    <w:bookmarkEnd w:id="165"/>
-    <w:bookmarkStart w:id="167" w:name="ref-caffarra2019"/>
+    <w:bookmarkEnd w:id="173"/>
+    <w:bookmarkStart w:id="175" w:name="ref-caffarra2019"/>
     <w:p>
       <w:pPr>
         <w:pStyle w:val="Bibliography"/>
@@ -23386,7 +23671,7 @@
       <w:r>
         <w:t xml:space="preserve"> </w:t>
       </w:r>
-      <w:hyperlink r:id="rId166">
+      <w:hyperlink r:id="rId174">
         <w:r>
           <w:rPr>
             <w:rStyle w:val="Hyperlink"/>
@@ -23395,8 +23680,8 @@
         </w:r>
       </w:hyperlink>
     </w:p>
-    <w:bookmarkEnd w:id="167"/>
-    <w:bookmarkStart w:id="169" w:name="ref-caffarra2015"/>
+    <w:bookmarkEnd w:id="175"/>
+    <w:bookmarkStart w:id="177" w:name="ref-caffarra2015"/>
     <w:p>
       <w:pPr>
         <w:pStyle w:val="Bibliography"/>
@@ -23433,7 +23718,7 @@
       <w:r>
         <w:t xml:space="preserve"> </w:t>
       </w:r>
-      <w:hyperlink r:id="rId168">
+      <w:hyperlink r:id="rId176">
         <w:r>
           <w:rPr>
             <w:rStyle w:val="Hyperlink"/>
@@ -23442,8 +23727,8 @@
         </w:r>
       </w:hyperlink>
     </w:p>
-    <w:bookmarkEnd w:id="169"/>
-    <w:bookmarkStart w:id="171" w:name="ref-carpenter2017"/>
+    <w:bookmarkEnd w:id="177"/>
+    <w:bookmarkStart w:id="179" w:name="ref-carpenter2017"/>
     <w:p>
       <w:pPr>
         <w:pStyle w:val="Bibliography"/>
@@ -23489,7 +23774,7 @@
       <w:r>
         <w:t xml:space="preserve"> </w:t>
       </w:r>
-      <w:hyperlink r:id="rId170">
+      <w:hyperlink r:id="rId178">
         <w:r>
           <w:rPr>
             <w:rStyle w:val="Hyperlink"/>
@@ -23498,8 +23783,8 @@
         </w:r>
       </w:hyperlink>
     </w:p>
-    <w:bookmarkEnd w:id="171"/>
-    <w:bookmarkStart w:id="173" w:name="ref-carrasco2024"/>
+    <w:bookmarkEnd w:id="179"/>
+    <w:bookmarkStart w:id="181" w:name="ref-carrasco2024"/>
     <w:p>
       <w:pPr>
         <w:pStyle w:val="Bibliography"/>
@@ -23536,7 +23821,7 @@
       <w:r>
         <w:t xml:space="preserve"> </w:t>
       </w:r>
-      <w:hyperlink r:id="rId172">
+      <w:hyperlink r:id="rId180">
         <w:r>
           <w:rPr>
             <w:rStyle w:val="Hyperlink"/>
@@ -23545,8 +23830,8 @@
         </w:r>
       </w:hyperlink>
     </w:p>
-    <w:bookmarkEnd w:id="173"/>
-    <w:bookmarkStart w:id="175" w:name="ref-castle2026"/>
+    <w:bookmarkEnd w:id="181"/>
+    <w:bookmarkStart w:id="183" w:name="ref-castle2026"/>
     <w:p>
       <w:pPr>
         <w:pStyle w:val="Bibliography"/>
@@ -23601,7 +23886,7 @@
       <w:r>
         <w:t xml:space="preserve"> </w:t>
       </w:r>
-      <w:hyperlink r:id="rId174">
+      <w:hyperlink r:id="rId182">
         <w:r>
           <w:rPr>
             <w:rStyle w:val="Hyperlink"/>
@@ -23610,8 +23895,8 @@
         </w:r>
       </w:hyperlink>
     </w:p>
-    <w:bookmarkEnd w:id="175"/>
-    <w:bookmarkStart w:id="177" w:name="ref-chen2007"/>
+    <w:bookmarkEnd w:id="183"/>
+    <w:bookmarkStart w:id="185" w:name="ref-chen2007"/>
     <w:p>
       <w:pPr>
         <w:pStyle w:val="Bibliography"/>
@@ -23672,7 +23957,7 @@
       <w:r>
         <w:t xml:space="preserve"> </w:t>
       </w:r>
-      <w:hyperlink r:id="rId176">
+      <w:hyperlink r:id="rId184">
         <w:r>
           <w:rPr>
             <w:rStyle w:val="Hyperlink"/>
@@ -23681,8 +23966,8 @@
         </w:r>
       </w:hyperlink>
     </w:p>
-    <w:bookmarkEnd w:id="177"/>
-    <w:bookmarkStart w:id="179" w:name="ref-cho2025"/>
+    <w:bookmarkEnd w:id="185"/>
+    <w:bookmarkStart w:id="187" w:name="ref-cho2025"/>
     <w:p>
       <w:pPr>
         <w:pStyle w:val="Bibliography"/>
@@ -23728,7 +24013,7 @@
       <w:r>
         <w:t xml:space="preserve"> </w:t>
       </w:r>
-      <w:hyperlink r:id="rId178">
+      <w:hyperlink r:id="rId186">
         <w:r>
           <w:rPr>
             <w:rStyle w:val="Hyperlink"/>
@@ -23737,8 +24022,8 @@
         </w:r>
       </w:hyperlink>
     </w:p>
-    <w:bookmarkEnd w:id="179"/>
-    <w:bookmarkStart w:id="181" w:name="ref-combrisson2015"/>
+    <w:bookmarkEnd w:id="187"/>
+    <w:bookmarkStart w:id="189" w:name="ref-combrisson2015"/>
     <w:p>
       <w:pPr>
         <w:pStyle w:val="Bibliography"/>
@@ -23775,7 +24060,7 @@
       <w:r>
         <w:t xml:space="preserve"> </w:t>
       </w:r>
-      <w:hyperlink r:id="rId180">
+      <w:hyperlink r:id="rId188">
         <w:r>
           <w:rPr>
             <w:rStyle w:val="Hyperlink"/>
@@ -23784,8 +24069,8 @@
         </w:r>
       </w:hyperlink>
     </w:p>
-    <w:bookmarkEnd w:id="181"/>
-    <w:bookmarkStart w:id="183" w:name="ref-davidson2009"/>
+    <w:bookmarkEnd w:id="189"/>
+    <w:bookmarkStart w:id="191" w:name="ref-davidson2009"/>
     <w:p>
       <w:pPr>
         <w:pStyle w:val="Bibliography"/>
@@ -23822,7 +24107,7 @@
       <w:r>
         <w:t xml:space="preserve"> </w:t>
       </w:r>
-      <w:hyperlink r:id="rId182">
+      <w:hyperlink r:id="rId190">
         <w:r>
           <w:rPr>
             <w:rStyle w:val="Hyperlink"/>
@@ -23831,8 +24116,8 @@
         </w:r>
       </w:hyperlink>
     </w:p>
-    <w:bookmarkEnd w:id="183"/>
-    <w:bookmarkStart w:id="185" w:name="ref-davis2009"/>
+    <w:bookmarkEnd w:id="191"/>
+    <w:bookmarkStart w:id="193" w:name="ref-davis2009"/>
     <w:p>
       <w:pPr>
         <w:pStyle w:val="Bibliography"/>
@@ -23869,7 +24154,7 @@
       <w:r>
         <w:t xml:space="preserve"> </w:t>
       </w:r>
-      <w:hyperlink r:id="rId184">
+      <w:hyperlink r:id="rId192">
         <w:r>
           <w:rPr>
             <w:rStyle w:val="Hyperlink"/>
@@ -23878,8 +24163,8 @@
         </w:r>
       </w:hyperlink>
     </w:p>
-    <w:bookmarkEnd w:id="185"/>
-    <w:bookmarkStart w:id="187" w:name="ref-davis2014"/>
+    <w:bookmarkEnd w:id="193"/>
+    <w:bookmarkStart w:id="195" w:name="ref-davis2014"/>
     <w:p>
       <w:pPr>
         <w:pStyle w:val="Bibliography"/>
@@ -23928,7 +24213,7 @@
       <w:r>
         <w:t xml:space="preserve"> </w:t>
       </w:r>
-      <w:hyperlink r:id="rId186">
+      <w:hyperlink r:id="rId194">
         <w:r>
           <w:rPr>
             <w:rStyle w:val="Hyperlink"/>
@@ -23937,8 +24222,8 @@
         </w:r>
       </w:hyperlink>
     </w:p>
-    <w:bookmarkEnd w:id="187"/>
-    <w:bookmarkStart w:id="189" w:name="ref-depaoli2017"/>
+    <w:bookmarkEnd w:id="195"/>
+    <w:bookmarkStart w:id="197" w:name="ref-depaoli2017"/>
     <w:p>
       <w:pPr>
         <w:pStyle w:val="Bibliography"/>
@@ -23996,7 +24281,7 @@
       <w:r>
         <w:t xml:space="preserve"> </w:t>
       </w:r>
-      <w:hyperlink r:id="rId188">
+      <w:hyperlink r:id="rId196">
         <w:r>
           <w:rPr>
             <w:rStyle w:val="Hyperlink"/>
@@ -24005,8 +24290,8 @@
         </w:r>
       </w:hyperlink>
     </w:p>
-    <w:bookmarkEnd w:id="189"/>
-    <w:bookmarkStart w:id="191" w:name="ref-dixon2008"/>
+    <w:bookmarkEnd w:id="197"/>
+    <w:bookmarkStart w:id="199" w:name="ref-dixon2008"/>
     <w:p>
       <w:pPr>
         <w:pStyle w:val="Bibliography"/>
@@ -24043,7 +24328,7 @@
       <w:r>
         <w:t xml:space="preserve"> </w:t>
       </w:r>
-      <w:hyperlink r:id="rId190">
+      <w:hyperlink r:id="rId198">
         <w:r>
           <w:rPr>
             <w:rStyle w:val="Hyperlink"/>
@@ -24052,8 +24337,8 @@
         </w:r>
       </w:hyperlink>
     </w:p>
-    <w:bookmarkEnd w:id="191"/>
-    <w:bookmarkStart w:id="193" w:name="ref-dudai2015"/>
+    <w:bookmarkEnd w:id="199"/>
+    <w:bookmarkStart w:id="201" w:name="ref-dudai2015"/>
     <w:p>
       <w:pPr>
         <w:pStyle w:val="Bibliography"/>
@@ -24090,7 +24375,7 @@
       <w:r>
         <w:t xml:space="preserve"> </w:t>
       </w:r>
-      <w:hyperlink r:id="rId192">
+      <w:hyperlink r:id="rId200">
         <w:r>
           <w:rPr>
             <w:rStyle w:val="Hyperlink"/>
@@ -24099,8 +24384,8 @@
         </w:r>
       </w:hyperlink>
     </w:p>
-    <w:bookmarkEnd w:id="193"/>
-    <w:bookmarkStart w:id="195" w:name="ref-falk2011"/>
+    <w:bookmarkEnd w:id="201"/>
+    <w:bookmarkStart w:id="203" w:name="ref-falk2011"/>
     <w:p>
       <w:pPr>
         <w:pStyle w:val="Bibliography"/>
@@ -24167,7 +24452,7 @@
       <w:r>
         <w:t xml:space="preserve"> </w:t>
       </w:r>
-      <w:hyperlink r:id="rId194">
+      <w:hyperlink r:id="rId202">
         <w:r>
           <w:rPr>
             <w:rStyle w:val="Hyperlink"/>
@@ -24176,8 +24461,8 @@
         </w:r>
       </w:hyperlink>
     </w:p>
-    <w:bookmarkEnd w:id="195"/>
-    <w:bookmarkStart w:id="197" w:name="ref-faust1999"/>
+    <w:bookmarkEnd w:id="203"/>
+    <w:bookmarkStart w:id="205" w:name="ref-faust1999"/>
     <w:p>
       <w:pPr>
         <w:pStyle w:val="Bibliography"/>
@@ -24214,7 +24499,7 @@
       <w:r>
         <w:t xml:space="preserve"> </w:t>
       </w:r>
-      <w:hyperlink r:id="rId196">
+      <w:hyperlink r:id="rId204">
         <w:r>
           <w:rPr>
             <w:rStyle w:val="Hyperlink"/>
@@ -24223,8 +24508,8 @@
         </w:r>
       </w:hyperlink>
     </w:p>
-    <w:bookmarkEnd w:id="197"/>
-    <w:bookmarkStart w:id="199" w:name="ref-flynn2004"/>
+    <w:bookmarkEnd w:id="205"/>
+    <w:bookmarkStart w:id="207" w:name="ref-flynn2004"/>
     <w:p>
       <w:pPr>
         <w:pStyle w:val="Bibliography"/>
@@ -24261,7 +24546,7 @@
       <w:r>
         <w:t xml:space="preserve"> </w:t>
       </w:r>
-      <w:hyperlink r:id="rId198">
+      <w:hyperlink r:id="rId206">
         <w:r>
           <w:rPr>
             <w:rStyle w:val="Hyperlink"/>
@@ -24270,8 +24555,8 @@
         </w:r>
       </w:hyperlink>
     </w:p>
-    <w:bookmarkEnd w:id="199"/>
-    <w:bookmarkStart w:id="201" w:name="ref-friederici2002tics"/>
+    <w:bookmarkEnd w:id="207"/>
+    <w:bookmarkStart w:id="209" w:name="ref-friederici2002tics"/>
     <w:p>
       <w:pPr>
         <w:pStyle w:val="Bibliography"/>
@@ -24308,7 +24593,7 @@
       <w:r>
         <w:t xml:space="preserve"> </w:t>
       </w:r>
-      <w:hyperlink r:id="rId200">
+      <w:hyperlink r:id="rId208">
         <w:r>
           <w:rPr>
             <w:rStyle w:val="Hyperlink"/>
@@ -24317,8 +24602,8 @@
         </w:r>
       </w:hyperlink>
     </w:p>
-    <w:bookmarkEnd w:id="201"/>
-    <w:bookmarkStart w:id="203" w:name="ref-friederici2002pnas"/>
+    <w:bookmarkEnd w:id="209"/>
+    <w:bookmarkStart w:id="211" w:name="ref-friederici2002pnas"/>
     <w:p>
       <w:pPr>
         <w:pStyle w:val="Bibliography"/>
@@ -24355,7 +24640,7 @@
       <w:r>
         <w:t xml:space="preserve"> </w:t>
       </w:r>
-      <w:hyperlink r:id="rId202">
+      <w:hyperlink r:id="rId210">
         <w:r>
           <w:rPr>
             <w:rStyle w:val="Hyperlink"/>
@@ -24364,8 +24649,8 @@
         </w:r>
       </w:hyperlink>
     </w:p>
-    <w:bookmarkEnd w:id="203"/>
-    <w:bookmarkStart w:id="205" w:name="ref-frisch2001"/>
+    <w:bookmarkEnd w:id="211"/>
+    <w:bookmarkStart w:id="213" w:name="ref-frisch2001"/>
     <w:p>
       <w:pPr>
         <w:pStyle w:val="Bibliography"/>
@@ -24414,7 +24699,7 @@
       <w:r>
         <w:t xml:space="preserve"> </w:t>
       </w:r>
-      <w:hyperlink r:id="rId204">
+      <w:hyperlink r:id="rId212">
         <w:r>
           <w:rPr>
             <w:rStyle w:val="Hyperlink"/>
@@ -24423,8 +24708,8 @@
         </w:r>
       </w:hyperlink>
     </w:p>
-    <w:bookmarkEnd w:id="205"/>
-    <w:bookmarkStart w:id="207" w:name="ref-gabry2019"/>
+    <w:bookmarkEnd w:id="213"/>
+    <w:bookmarkStart w:id="215" w:name="ref-gabry2019"/>
     <w:p>
       <w:pPr>
         <w:pStyle w:val="Bibliography"/>
@@ -24473,7 +24758,7 @@
       <w:r>
         <w:t xml:space="preserve"> </w:t>
       </w:r>
-      <w:hyperlink r:id="rId206">
+      <w:hyperlink r:id="rId214">
         <w:r>
           <w:rPr>
             <w:rStyle w:val="Hyperlink"/>
@@ -24482,8 +24767,8 @@
         </w:r>
       </w:hyperlink>
     </w:p>
-    <w:bookmarkEnd w:id="207"/>
-    <w:bookmarkStart w:id="209" w:name="ref-gelman2006"/>
+    <w:bookmarkEnd w:id="215"/>
+    <w:bookmarkStart w:id="217" w:name="ref-gelman2006"/>
     <w:p>
       <w:pPr>
         <w:pStyle w:val="Bibliography"/>
@@ -24538,7 +24823,7 @@
       <w:r>
         <w:t xml:space="preserve"> </w:t>
       </w:r>
-      <w:hyperlink r:id="rId208">
+      <w:hyperlink r:id="rId216">
         <w:r>
           <w:rPr>
             <w:rStyle w:val="Hyperlink"/>
@@ -24547,8 +24832,8 @@
         </w:r>
       </w:hyperlink>
     </w:p>
-    <w:bookmarkEnd w:id="209"/>
-    <w:bookmarkStart w:id="211" w:name="ref-gelmancarlin2014"/>
+    <w:bookmarkEnd w:id="217"/>
+    <w:bookmarkStart w:id="219" w:name="ref-gelmancarlin2014"/>
     <w:p>
       <w:pPr>
         <w:pStyle w:val="Bibliography"/>
@@ -24609,7 +24894,7 @@
       <w:r>
         <w:t xml:space="preserve"> </w:t>
       </w:r>
-      <w:hyperlink r:id="rId210">
+      <w:hyperlink r:id="rId218">
         <w:r>
           <w:rPr>
             <w:rStyle w:val="Hyperlink"/>
@@ -24618,8 +24903,8 @@
         </w:r>
       </w:hyperlink>
     </w:p>
-    <w:bookmarkEnd w:id="211"/>
-    <w:bookmarkStart w:id="213" w:name="ref-gelmanhillyajima2012"/>
+    <w:bookmarkEnd w:id="219"/>
+    <w:bookmarkStart w:id="221" w:name="ref-gelmanhillyajima2012"/>
     <w:p>
       <w:pPr>
         <w:pStyle w:val="Bibliography"/>
@@ -24656,7 +24941,7 @@
       <w:r>
         <w:t xml:space="preserve"> </w:t>
       </w:r>
-      <w:hyperlink r:id="rId212">
+      <w:hyperlink r:id="rId220">
         <w:r>
           <w:rPr>
             <w:rStyle w:val="Hyperlink"/>
@@ -24665,8 +24950,8 @@
         </w:r>
       </w:hyperlink>
     </w:p>
-    <w:bookmarkEnd w:id="213"/>
-    <w:bookmarkStart w:id="215" w:name="ref-gelman2008"/>
+    <w:bookmarkEnd w:id="221"/>
+    <w:bookmarkStart w:id="223" w:name="ref-gelman2008"/>
     <w:p>
       <w:pPr>
         <w:pStyle w:val="Bibliography"/>
@@ -24703,7 +24988,7 @@
       <w:r>
         <w:t xml:space="preserve"> </w:t>
       </w:r>
-      <w:hyperlink r:id="rId214">
+      <w:hyperlink r:id="rId222">
         <w:r>
           <w:rPr>
             <w:rStyle w:val="Hyperlink"/>
@@ -24712,8 +24997,8 @@
         </w:r>
       </w:hyperlink>
     </w:p>
-    <w:bookmarkEnd w:id="215"/>
-    <w:bookmarkStart w:id="217" w:name="ref-gelmanstern2006"/>
+    <w:bookmarkEnd w:id="223"/>
+    <w:bookmarkStart w:id="225" w:name="ref-gelmanstern2006"/>
     <w:p>
       <w:pPr>
         <w:pStyle w:val="Bibliography"/>
@@ -24774,7 +25059,7 @@
       <w:r>
         <w:t xml:space="preserve"> </w:t>
       </w:r>
-      <w:hyperlink r:id="rId216">
+      <w:hyperlink r:id="rId224">
         <w:r>
           <w:rPr>
             <w:rStyle w:val="Hyperlink"/>
@@ -24783,8 +25068,8 @@
         </w:r>
       </w:hyperlink>
     </w:p>
-    <w:bookmarkEnd w:id="217"/>
-    <w:bookmarkStart w:id="219" w:name="ref-gonzalezalonso2020"/>
+    <w:bookmarkEnd w:id="225"/>
+    <w:bookmarkStart w:id="227" w:name="ref-gonzalezalonso2020"/>
     <w:p>
       <w:pPr>
         <w:pStyle w:val="Bibliography"/>
@@ -24821,7 +25106,7 @@
       <w:r>
         <w:t xml:space="preserve"> </w:t>
       </w:r>
-      <w:hyperlink r:id="rId218">
+      <w:hyperlink r:id="rId226">
         <w:r>
           <w:rPr>
             <w:rStyle w:val="Hyperlink"/>
@@ -24830,8 +25115,8 @@
         </w:r>
       </w:hyperlink>
     </w:p>
-    <w:bookmarkEnd w:id="219"/>
-    <w:bookmarkStart w:id="221" w:name="ref-gonzalezalonso2025"/>
+    <w:bookmarkEnd w:id="227"/>
+    <w:bookmarkStart w:id="229" w:name="ref-gonzalezalonso2025"/>
     <w:p>
       <w:pPr>
         <w:pStyle w:val="Bibliography"/>
@@ -24883,7 +25168,7 @@
       <w:r>
         <w:t xml:space="preserve"> </w:t>
       </w:r>
-      <w:hyperlink r:id="rId220">
+      <w:hyperlink r:id="rId228">
         <w:r>
           <w:rPr>
             <w:rStyle w:val="Hyperlink"/>
@@ -24892,8 +25177,8 @@
         </w:r>
       </w:hyperlink>
     </w:p>
-    <w:bookmarkEnd w:id="221"/>
-    <w:bookmarkStart w:id="223" w:name="ref-gonzalezalonso2021"/>
+    <w:bookmarkEnd w:id="229"/>
+    <w:bookmarkStart w:id="231" w:name="ref-gonzalezalonso2021"/>
     <w:p>
       <w:pPr>
         <w:pStyle w:val="Bibliography"/>
@@ -24930,7 +25215,7 @@
       <w:r>
         <w:t xml:space="preserve"> </w:t>
       </w:r>
-      <w:hyperlink r:id="rId222">
+      <w:hyperlink r:id="rId230">
         <w:r>
           <w:rPr>
             <w:rStyle w:val="Hyperlink"/>
@@ -24939,8 +25224,8 @@
         </w:r>
       </w:hyperlink>
     </w:p>
-    <w:bookmarkEnd w:id="223"/>
-    <w:bookmarkStart w:id="225" w:name="ref-grey2018"/>
+    <w:bookmarkEnd w:id="231"/>
+    <w:bookmarkStart w:id="233" w:name="ref-grey2018"/>
     <w:p>
       <w:pPr>
         <w:pStyle w:val="Bibliography"/>
@@ -24989,7 +25274,7 @@
       <w:r>
         <w:t xml:space="preserve"> </w:t>
       </w:r>
-      <w:hyperlink r:id="rId224">
+      <w:hyperlink r:id="rId232">
         <w:r>
           <w:rPr>
             <w:rStyle w:val="Hyperlink"/>
@@ -24998,8 +25283,8 @@
         </w:r>
       </w:hyperlink>
     </w:p>
-    <w:bookmarkEnd w:id="225"/>
-    <w:bookmarkStart w:id="227" w:name="ref-grootswagers2017"/>
+    <w:bookmarkEnd w:id="233"/>
+    <w:bookmarkStart w:id="235" w:name="ref-grootswagers2017"/>
     <w:p>
       <w:pPr>
         <w:pStyle w:val="Bibliography"/>
@@ -25036,7 +25321,7 @@
       <w:r>
         <w:t xml:space="preserve"> </w:t>
       </w:r>
-      <w:hyperlink r:id="rId226">
+      <w:hyperlink r:id="rId234">
         <w:r>
           <w:rPr>
             <w:rStyle w:val="Hyperlink"/>
@@ -25045,8 +25330,8 @@
         </w:r>
       </w:hyperlink>
     </w:p>
-    <w:bookmarkEnd w:id="227"/>
-    <w:bookmarkStart w:id="229" w:name="ref-haxby2001"/>
+    <w:bookmarkEnd w:id="235"/>
+    <w:bookmarkStart w:id="237" w:name="ref-haxby2001"/>
     <w:p>
       <w:pPr>
         <w:pStyle w:val="Bibliography"/>
@@ -25083,7 +25368,7 @@
       <w:r>
         <w:t xml:space="preserve"> </w:t>
       </w:r>
-      <w:hyperlink r:id="rId228">
+      <w:hyperlink r:id="rId236">
         <w:r>
           <w:rPr>
             <w:rStyle w:val="Hyperlink"/>
@@ -25092,8 +25377,8 @@
         </w:r>
       </w:hyperlink>
     </w:p>
-    <w:bookmarkEnd w:id="229"/>
-    <w:bookmarkStart w:id="231" w:name="ref-he2024"/>
+    <w:bookmarkEnd w:id="237"/>
+    <w:bookmarkStart w:id="239" w:name="ref-he2024"/>
     <w:p>
       <w:pPr>
         <w:pStyle w:val="Bibliography"/>
@@ -25154,7 +25439,7 @@
       <w:r>
         <w:t xml:space="preserve"> </w:t>
       </w:r>
-      <w:hyperlink r:id="rId230">
+      <w:hyperlink r:id="rId238">
         <w:r>
           <w:rPr>
             <w:rStyle w:val="Hyperlink"/>
@@ -25163,8 +25448,8 @@
         </w:r>
       </w:hyperlink>
     </w:p>
-    <w:bookmarkEnd w:id="231"/>
-    <w:bookmarkStart w:id="233" w:name="ref-hebart2018"/>
+    <w:bookmarkEnd w:id="239"/>
+    <w:bookmarkStart w:id="241" w:name="ref-hebart2018"/>
     <w:p>
       <w:pPr>
         <w:pStyle w:val="Bibliography"/>
@@ -25201,7 +25486,7 @@
       <w:r>
         <w:t xml:space="preserve"> </w:t>
       </w:r>
-      <w:hyperlink r:id="rId232">
+      <w:hyperlink r:id="rId240">
         <w:r>
           <w:rPr>
             <w:rStyle w:val="Hyperlink"/>
@@ -25210,8 +25495,8 @@
         </w:r>
       </w:hyperlink>
     </w:p>
-    <w:bookmarkEnd w:id="233"/>
-    <w:bookmarkStart w:id="235" w:name="ref-jaeger2008"/>
+    <w:bookmarkEnd w:id="241"/>
+    <w:bookmarkStart w:id="243" w:name="ref-jaeger2008"/>
     <w:p>
       <w:pPr>
         <w:pStyle w:val="Bibliography"/>
@@ -25260,7 +25545,7 @@
       <w:r>
         <w:t xml:space="preserve"> </w:t>
       </w:r>
-      <w:hyperlink r:id="rId234">
+      <w:hyperlink r:id="rId242">
         <w:r>
           <w:rPr>
             <w:rStyle w:val="Hyperlink"/>
@@ -25269,8 +25554,8 @@
         </w:r>
       </w:hyperlink>
     </w:p>
-    <w:bookmarkEnd w:id="235"/>
-    <w:bookmarkStart w:id="237" w:name="ref-kaan2003"/>
+    <w:bookmarkEnd w:id="243"/>
+    <w:bookmarkStart w:id="245" w:name="ref-kaan2003"/>
     <w:p>
       <w:pPr>
         <w:pStyle w:val="Bibliography"/>
@@ -25307,7 +25592,7 @@
       <w:r>
         <w:t xml:space="preserve"> </w:t>
       </w:r>
-      <w:hyperlink r:id="rId236">
+      <w:hyperlink r:id="rId244">
         <w:r>
           <w:rPr>
             <w:rStyle w:val="Hyperlink"/>
@@ -25316,8 +25601,8 @@
         </w:r>
       </w:hyperlink>
     </w:p>
-    <w:bookmarkEnd w:id="237"/>
-    <w:bookmarkStart w:id="239" w:name="ref-kaplan2015"/>
+    <w:bookmarkEnd w:id="245"/>
+    <w:bookmarkStart w:id="247" w:name="ref-kaplan2015"/>
     <w:p>
       <w:pPr>
         <w:pStyle w:val="Bibliography"/>
@@ -25354,7 +25639,7 @@
       <w:r>
         <w:t xml:space="preserve"> </w:t>
       </w:r>
-      <w:hyperlink r:id="rId238">
+      <w:hyperlink r:id="rId246">
         <w:r>
           <w:rPr>
             <w:rStyle w:val="Hyperlink"/>
@@ -25363,8 +25648,8 @@
         </w:r>
       </w:hyperlink>
     </w:p>
-    <w:bookmarkEnd w:id="239"/>
-    <w:bookmarkStart w:id="241" w:name="ref-keysers2020"/>
+    <w:bookmarkEnd w:id="247"/>
+    <w:bookmarkStart w:id="249" w:name="ref-keysers2020"/>
     <w:p>
       <w:pPr>
         <w:pStyle w:val="Bibliography"/>
@@ -25413,7 +25698,7 @@
       <w:r>
         <w:t xml:space="preserve"> </w:t>
       </w:r>
-      <w:hyperlink r:id="rId240">
+      <w:hyperlink r:id="rId248">
         <w:r>
           <w:rPr>
             <w:rStyle w:val="Hyperlink"/>
@@ -25422,8 +25707,8 @@
         </w:r>
       </w:hyperlink>
     </w:p>
-    <w:bookmarkEnd w:id="241"/>
-    <w:bookmarkStart w:id="243" w:name="ref-kim2024"/>
+    <w:bookmarkEnd w:id="249"/>
+    <w:bookmarkStart w:id="251" w:name="ref-kim2024"/>
     <w:p>
       <w:pPr>
         <w:pStyle w:val="Bibliography"/>
@@ -25496,7 +25781,7 @@
       <w:r>
         <w:t xml:space="preserve"> </w:t>
       </w:r>
-      <w:hyperlink r:id="rId242">
+      <w:hyperlink r:id="rId250">
         <w:r>
           <w:rPr>
             <w:rStyle w:val="Hyperlink"/>
@@ -25505,8 +25790,8 @@
         </w:r>
       </w:hyperlink>
     </w:p>
-    <w:bookmarkEnd w:id="243"/>
-    <w:bookmarkStart w:id="245" w:name="ref-king2014"/>
+    <w:bookmarkEnd w:id="251"/>
+    <w:bookmarkStart w:id="253" w:name="ref-king2014"/>
     <w:p>
       <w:pPr>
         <w:pStyle w:val="Bibliography"/>
@@ -25543,7 +25828,7 @@
       <w:r>
         <w:t xml:space="preserve"> </w:t>
       </w:r>
-      <w:hyperlink r:id="rId244">
+      <w:hyperlink r:id="rId252">
         <w:r>
           <w:rPr>
             <w:rStyle w:val="Hyperlink"/>
@@ -25552,8 +25837,8 @@
         </w:r>
       </w:hyperlink>
     </w:p>
-    <w:bookmarkEnd w:id="245"/>
-    <w:bookmarkStart w:id="247" w:name="ref-kriegeskorte2008rsa"/>
+    <w:bookmarkEnd w:id="253"/>
+    <w:bookmarkStart w:id="255" w:name="ref-kriegeskorte2008rsa"/>
     <w:p>
       <w:pPr>
         <w:pStyle w:val="Bibliography"/>
@@ -25590,7 +25875,7 @@
       <w:r>
         <w:t xml:space="preserve"> </w:t>
       </w:r>
-      <w:hyperlink r:id="rId246">
+      <w:hyperlink r:id="rId254">
         <w:r>
           <w:rPr>
             <w:rStyle w:val="Hyperlink"/>
@@ -25599,8 +25884,8 @@
         </w:r>
       </w:hyperlink>
     </w:p>
-    <w:bookmarkEnd w:id="247"/>
-    <w:bookmarkStart w:id="249" w:name="ref-kriegeskorte2009"/>
+    <w:bookmarkEnd w:id="255"/>
+    <w:bookmarkStart w:id="257" w:name="ref-kriegeskorte2009"/>
     <w:p>
       <w:pPr>
         <w:pStyle w:val="Bibliography"/>
@@ -25637,7 +25922,7 @@
       <w:r>
         <w:t xml:space="preserve"> </w:t>
       </w:r>
-      <w:hyperlink r:id="rId248">
+      <w:hyperlink r:id="rId256">
         <w:r>
           <w:rPr>
             <w:rStyle w:val="Hyperlink"/>
@@ -25646,8 +25931,8 @@
         </w:r>
       </w:hyperlink>
     </w:p>
-    <w:bookmarkEnd w:id="249"/>
-    <w:bookmarkStart w:id="251" w:name="ref-kruschke2021"/>
+    <w:bookmarkEnd w:id="257"/>
+    <w:bookmarkStart w:id="259" w:name="ref-kruschke2021"/>
     <w:p>
       <w:pPr>
         <w:pStyle w:val="Bibliography"/>
@@ -25696,7 +25981,7 @@
       <w:r>
         <w:t xml:space="preserve"> </w:t>
       </w:r>
-      <w:hyperlink r:id="rId250">
+      <w:hyperlink r:id="rId258">
         <w:r>
           <w:rPr>
             <w:rStyle w:val="Hyperlink"/>
@@ -25705,8 +25990,8 @@
         </w:r>
       </w:hyperlink>
     </w:p>
-    <w:bookmarkEnd w:id="251"/>
-    <w:bookmarkStart w:id="253" w:name="ref-kruschke2018"/>
+    <w:bookmarkEnd w:id="259"/>
+    <w:bookmarkStart w:id="261" w:name="ref-kruschke2018"/>
     <w:p>
       <w:pPr>
         <w:pStyle w:val="Bibliography"/>
@@ -25776,7 +26061,7 @@
       <w:r>
         <w:t xml:space="preserve"> </w:t>
       </w:r>
-      <w:hyperlink r:id="rId252">
+      <w:hyperlink r:id="rId260">
         <w:r>
           <w:rPr>
             <w:rStyle w:val="Hyperlink"/>
@@ -25785,8 +26070,8 @@
         </w:r>
       </w:hyperlink>
     </w:p>
-    <w:bookmarkEnd w:id="253"/>
-    <w:bookmarkStart w:id="255" w:name="ref-lewandowski2009"/>
+    <w:bookmarkEnd w:id="261"/>
+    <w:bookmarkStart w:id="263" w:name="ref-lewandowski2009"/>
     <w:p>
       <w:pPr>
         <w:pStyle w:val="Bibliography"/>
@@ -25823,7 +26108,7 @@
       <w:r>
         <w:t xml:space="preserve"> </w:t>
       </w:r>
-      <w:hyperlink r:id="rId254">
+      <w:hyperlink r:id="rId262">
         <w:r>
           <w:rPr>
             <w:rStyle w:val="Hyperlink"/>
@@ -25832,8 +26117,8 @@
         </w:r>
       </w:hyperlink>
     </w:p>
-    <w:bookmarkEnd w:id="255"/>
-    <w:bookmarkStart w:id="257" w:name="ref-lhq3"/>
+    <w:bookmarkEnd w:id="263"/>
+    <w:bookmarkStart w:id="265" w:name="ref-lhq3"/>
     <w:p>
       <w:pPr>
         <w:pStyle w:val="Bibliography"/>
@@ -25888,7 +26173,7 @@
       <w:r>
         <w:t xml:space="preserve"> </w:t>
       </w:r>
-      <w:hyperlink r:id="rId256">
+      <w:hyperlink r:id="rId264">
         <w:r>
           <w:rPr>
             <w:rStyle w:val="Hyperlink"/>
@@ -25897,8 +26182,8 @@
         </w:r>
       </w:hyperlink>
     </w:p>
-    <w:bookmarkEnd w:id="257"/>
-    <w:bookmarkStart w:id="259" w:name="ref-loken2017"/>
+    <w:bookmarkEnd w:id="265"/>
+    <w:bookmarkStart w:id="267" w:name="ref-loken2017"/>
     <w:p>
       <w:pPr>
         <w:pStyle w:val="Bibliography"/>
@@ -25935,7 +26220,7 @@
       <w:r>
         <w:t xml:space="preserve"> </w:t>
       </w:r>
-      <w:hyperlink r:id="rId258">
+      <w:hyperlink r:id="rId266">
         <w:r>
           <w:rPr>
             <w:rStyle w:val="Hyperlink"/>
@@ -25944,8 +26229,8 @@
         </w:r>
       </w:hyperlink>
     </w:p>
-    <w:bookmarkEnd w:id="259"/>
-    <w:bookmarkStart w:id="261" w:name="ref-makowski2019"/>
+    <w:bookmarkEnd w:id="267"/>
+    <w:bookmarkStart w:id="269" w:name="ref-makowski2019"/>
     <w:p>
       <w:pPr>
         <w:pStyle w:val="Bibliography"/>
@@ -25994,7 +26279,7 @@
       <w:r>
         <w:t xml:space="preserve"> </w:t>
       </w:r>
-      <w:hyperlink r:id="rId260">
+      <w:hyperlink r:id="rId268">
         <w:r>
           <w:rPr>
             <w:rStyle w:val="Hyperlink"/>
@@ -26003,8 +26288,8 @@
         </w:r>
       </w:hyperlink>
     </w:p>
-    <w:bookmarkEnd w:id="261"/>
-    <w:bookmarkStart w:id="263" w:name="ref-maris2007"/>
+    <w:bookmarkEnd w:id="269"/>
+    <w:bookmarkStart w:id="271" w:name="ref-maris2007"/>
     <w:p>
       <w:pPr>
         <w:pStyle w:val="Bibliography"/>
@@ -26059,7 +26344,7 @@
       <w:r>
         <w:t xml:space="preserve"> </w:t>
       </w:r>
-      <w:hyperlink r:id="rId262">
+      <w:hyperlink r:id="rId270">
         <w:r>
           <w:rPr>
             <w:rStyle w:val="Hyperlink"/>
@@ -26068,8 +26353,8 @@
         </w:r>
       </w:hyperlink>
     </w:p>
-    <w:bookmarkEnd w:id="263"/>
-    <w:bookmarkStart w:id="265" w:name="ref-marwick2018"/>
+    <w:bookmarkEnd w:id="271"/>
+    <w:bookmarkStart w:id="273" w:name="ref-marwick2018"/>
     <w:p>
       <w:pPr>
         <w:pStyle w:val="Bibliography"/>
@@ -26118,7 +26403,7 @@
       <w:r>
         <w:t xml:space="preserve"> </w:t>
       </w:r>
-      <w:hyperlink r:id="rId264">
+      <w:hyperlink r:id="rId272">
         <w:r>
           <w:rPr>
             <w:rStyle w:val="Hyperlink"/>
@@ -26127,8 +26412,8 @@
         </w:r>
       </w:hyperlink>
     </w:p>
-    <w:bookmarkEnd w:id="265"/>
-    <w:bookmarkStart w:id="267" w:name="ref-matuschek2017"/>
+    <w:bookmarkEnd w:id="273"/>
+    <w:bookmarkStart w:id="275" w:name="ref-matuschek2017"/>
     <w:p>
       <w:pPr>
         <w:pStyle w:val="Bibliography"/>
@@ -26183,7 +26468,7 @@
       <w:r>
         <w:t xml:space="preserve"> </w:t>
       </w:r>
-      <w:hyperlink r:id="rId266">
+      <w:hyperlink r:id="rId274">
         <w:r>
           <w:rPr>
             <w:rStyle w:val="Hyperlink"/>
@@ -26192,8 +26477,8 @@
         </w:r>
       </w:hyperlink>
     </w:p>
-    <w:bookmarkEnd w:id="267"/>
-    <w:bookmarkStart w:id="269" w:name="ref-mclaughlin2004"/>
+    <w:bookmarkEnd w:id="275"/>
+    <w:bookmarkStart w:id="277" w:name="ref-mclaughlin2004"/>
     <w:p>
       <w:pPr>
         <w:pStyle w:val="Bibliography"/>
@@ -26230,7 +26515,7 @@
       <w:r>
         <w:t xml:space="preserve"> </w:t>
       </w:r>
-      <w:hyperlink r:id="rId268">
+      <w:hyperlink r:id="rId276">
         <w:r>
           <w:rPr>
             <w:rStyle w:val="Hyperlink"/>
@@ -26239,8 +26524,8 @@
         </w:r>
       </w:hyperlink>
     </w:p>
-    <w:bookmarkEnd w:id="269"/>
-    <w:bookmarkStart w:id="271" w:name="ref-mirkovic2016"/>
+    <w:bookmarkEnd w:id="277"/>
+    <w:bookmarkStart w:id="279" w:name="ref-mirkovic2016"/>
     <w:p>
       <w:pPr>
         <w:pStyle w:val="Bibliography"/>
@@ -26277,7 +26562,7 @@
       <w:r>
         <w:t xml:space="preserve"> </w:t>
       </w:r>
-      <w:hyperlink r:id="rId270">
+      <w:hyperlink r:id="rId278">
         <w:r>
           <w:rPr>
             <w:rStyle w:val="Hyperlink"/>
@@ -26286,8 +26571,8 @@
         </w:r>
       </w:hyperlink>
     </w:p>
-    <w:bookmarkEnd w:id="271"/>
-    <w:bookmarkStart w:id="273" w:name="ref-mitrofanova2023"/>
+    <w:bookmarkEnd w:id="279"/>
+    <w:bookmarkStart w:id="281" w:name="ref-mitrofanova2023"/>
     <w:p>
       <w:pPr>
         <w:pStyle w:val="Bibliography"/>
@@ -26336,7 +26621,7 @@
       <w:r>
         <w:t xml:space="preserve"> </w:t>
       </w:r>
-      <w:hyperlink r:id="rId272">
+      <w:hyperlink r:id="rId280">
         <w:r>
           <w:rPr>
             <w:rStyle w:val="Hyperlink"/>
@@ -26345,8 +26630,8 @@
         </w:r>
       </w:hyperlink>
     </w:p>
-    <w:bookmarkEnd w:id="273"/>
-    <w:bookmarkStart w:id="275" w:name="ref-morganshort2012plos"/>
+    <w:bookmarkEnd w:id="281"/>
+    <w:bookmarkStart w:id="283" w:name="ref-morganshort2012plos"/>
     <w:p>
       <w:pPr>
         <w:pStyle w:val="Bibliography"/>
@@ -26383,7 +26668,7 @@
       <w:r>
         <w:t xml:space="preserve"> </w:t>
       </w:r>
-      <w:hyperlink r:id="rId274">
+      <w:hyperlink r:id="rId282">
         <w:r>
           <w:rPr>
             <w:rStyle w:val="Hyperlink"/>
@@ -26392,8 +26677,8 @@
         </w:r>
       </w:hyperlink>
     </w:p>
-    <w:bookmarkEnd w:id="275"/>
-    <w:bookmarkStart w:id="277" w:name="ref-morganshort2010"/>
+    <w:bookmarkEnd w:id="283"/>
+    <w:bookmarkStart w:id="285" w:name="ref-morganshort2010"/>
     <w:p>
       <w:pPr>
         <w:pStyle w:val="Bibliography"/>
@@ -26430,7 +26715,7 @@
       <w:r>
         <w:t xml:space="preserve"> </w:t>
       </w:r>
-      <w:hyperlink r:id="rId276">
+      <w:hyperlink r:id="rId284">
         <w:r>
           <w:rPr>
             <w:rStyle w:val="Hyperlink"/>
@@ -26439,8 +26724,8 @@
         </w:r>
       </w:hyperlink>
     </w:p>
-    <w:bookmarkEnd w:id="277"/>
-    <w:bookmarkStart w:id="279" w:name="ref-morganshort2012"/>
+    <w:bookmarkEnd w:id="285"/>
+    <w:bookmarkStart w:id="287" w:name="ref-morganshort2012"/>
     <w:p>
       <w:pPr>
         <w:pStyle w:val="Bibliography"/>
@@ -26477,7 +26762,7 @@
       <w:r>
         <w:t xml:space="preserve"> </w:t>
       </w:r>
-      <w:hyperlink r:id="rId278">
+      <w:hyperlink r:id="rId286">
         <w:r>
           <w:rPr>
             <w:rStyle w:val="Hyperlink"/>
@@ -26486,8 +26771,8 @@
         </w:r>
       </w:hyperlink>
     </w:p>
-    <w:bookmarkEnd w:id="279"/>
-    <w:bookmarkStart w:id="281" w:name="ref-mueller2005"/>
+    <w:bookmarkEnd w:id="287"/>
+    <w:bookmarkStart w:id="289" w:name="ref-mueller2005"/>
     <w:p>
       <w:pPr>
         <w:pStyle w:val="Bibliography"/>
@@ -26545,7 +26830,7 @@
       <w:r>
         <w:t xml:space="preserve"> </w:t>
       </w:r>
-      <w:hyperlink r:id="rId280">
+      <w:hyperlink r:id="rId288">
         <w:r>
           <w:rPr>
             <w:rStyle w:val="Hyperlink"/>
@@ -26554,8 +26839,8 @@
         </w:r>
       </w:hyperlink>
     </w:p>
-    <w:bookmarkEnd w:id="281"/>
-    <w:bookmarkStart w:id="283" w:name="ref-mueller2007"/>
+    <w:bookmarkEnd w:id="289"/>
+    <w:bookmarkStart w:id="291" w:name="ref-mueller2007"/>
     <w:p>
       <w:pPr>
         <w:pStyle w:val="Bibliography"/>
@@ -26604,7 +26889,7 @@
       <w:r>
         <w:t xml:space="preserve"> </w:t>
       </w:r>
-      <w:hyperlink r:id="rId282">
+      <w:hyperlink r:id="rId290">
         <w:r>
           <w:rPr>
             <w:rStyle w:val="Hyperlink"/>
@@ -26613,8 +26898,8 @@
         </w:r>
       </w:hyperlink>
     </w:p>
-    <w:bookmarkEnd w:id="283"/>
-    <w:bookmarkStart w:id="285" w:name="ref-mueller2009"/>
+    <w:bookmarkEnd w:id="291"/>
+    <w:bookmarkStart w:id="293" w:name="ref-mueller2009"/>
     <w:p>
       <w:pPr>
         <w:pStyle w:val="Bibliography"/>
@@ -26663,7 +26948,7 @@
       <w:r>
         <w:t xml:space="preserve"> </w:t>
       </w:r>
-      <w:hyperlink r:id="rId284">
+      <w:hyperlink r:id="rId292">
         <w:r>
           <w:rPr>
             <w:rStyle w:val="Hyperlink"/>
@@ -26672,8 +26957,8 @@
         </w:r>
       </w:hyperlink>
     </w:p>
-    <w:bookmarkEnd w:id="285"/>
-    <w:bookmarkStart w:id="287" w:name="ref-nichols2019"/>
+    <w:bookmarkEnd w:id="293"/>
+    <w:bookmarkStart w:id="295" w:name="ref-nichols2019"/>
     <w:p>
       <w:pPr>
         <w:pStyle w:val="Bibliography"/>
@@ -26722,7 +27007,7 @@
       <w:r>
         <w:t xml:space="preserve"> </w:t>
       </w:r>
-      <w:hyperlink r:id="rId286">
+      <w:hyperlink r:id="rId294">
         <w:r>
           <w:rPr>
             <w:rStyle w:val="Hyperlink"/>
@@ -26731,8 +27016,8 @@
         </w:r>
       </w:hyperlink>
     </w:p>
-    <w:bookmarkEnd w:id="287"/>
-    <w:bookmarkStart w:id="289" w:name="ref-nichols2002"/>
+    <w:bookmarkEnd w:id="295"/>
+    <w:bookmarkStart w:id="297" w:name="ref-nichols2002"/>
     <w:p>
       <w:pPr>
         <w:pStyle w:val="Bibliography"/>
@@ -26769,7 +27054,7 @@
       <w:r>
         <w:t xml:space="preserve"> </w:t>
       </w:r>
-      <w:hyperlink r:id="rId288">
+      <w:hyperlink r:id="rId296">
         <w:r>
           <w:rPr>
             <w:rStyle w:val="Hyperlink"/>
@@ -26778,8 +27063,8 @@
         </w:r>
       </w:hyperlink>
     </w:p>
-    <w:bookmarkEnd w:id="289"/>
-    <w:bookmarkStart w:id="291" w:name="ref-nieuwenhuis2013"/>
+    <w:bookmarkEnd w:id="297"/>
+    <w:bookmarkStart w:id="299" w:name="ref-nieuwenhuis2013"/>
     <w:p>
       <w:pPr>
         <w:pStyle w:val="Bibliography"/>
@@ -26816,7 +27101,7 @@
       <w:r>
         <w:t xml:space="preserve"> </w:t>
       </w:r>
-      <w:hyperlink r:id="rId290">
+      <w:hyperlink r:id="rId298">
         <w:r>
           <w:rPr>
             <w:rStyle w:val="Hyperlink"/>
@@ -26825,8 +27110,8 @@
         </w:r>
       </w:hyperlink>
     </w:p>
-    <w:bookmarkEnd w:id="291"/>
-    <w:bookmarkStart w:id="293" w:name="ref-nieuwenhuis2011"/>
+    <w:bookmarkEnd w:id="299"/>
+    <w:bookmarkStart w:id="301" w:name="ref-nieuwenhuis2011"/>
     <w:p>
       <w:pPr>
         <w:pStyle w:val="Bibliography"/>
@@ -26863,7 +27148,7 @@
       <w:r>
         <w:t xml:space="preserve"> </w:t>
       </w:r>
-      <w:hyperlink r:id="rId292">
+      <w:hyperlink r:id="rId300">
         <w:r>
           <w:rPr>
             <w:rStyle w:val="Hyperlink"/>
@@ -26872,8 +27157,8 @@
         </w:r>
       </w:hyperlink>
     </w:p>
-    <w:bookmarkEnd w:id="293"/>
-    <w:bookmarkStart w:id="295" w:name="ref-nieuwland2013"/>
+    <w:bookmarkEnd w:id="301"/>
+    <w:bookmarkStart w:id="303" w:name="ref-nieuwland2013"/>
     <w:p>
       <w:pPr>
         <w:pStyle w:val="Bibliography"/>
@@ -26910,7 +27195,7 @@
       <w:r>
         <w:t xml:space="preserve"> </w:t>
       </w:r>
-      <w:hyperlink r:id="rId294">
+      <w:hyperlink r:id="rId302">
         <w:r>
           <w:rPr>
             <w:rStyle w:val="Hyperlink"/>
@@ -26919,8 +27204,8 @@
         </w:r>
       </w:hyperlink>
     </w:p>
-    <w:bookmarkEnd w:id="295"/>
-    <w:bookmarkStart w:id="297" w:name="ref-nosek2018"/>
+    <w:bookmarkEnd w:id="303"/>
+    <w:bookmarkStart w:id="305" w:name="ref-nosek2018"/>
     <w:p>
       <w:pPr>
         <w:pStyle w:val="Bibliography"/>
@@ -26957,7 +27242,7 @@
       <w:r>
         <w:t xml:space="preserve"> </w:t>
       </w:r>
-      <w:hyperlink r:id="rId296">
+      <w:hyperlink r:id="rId304">
         <w:r>
           <w:rPr>
             <w:rStyle w:val="Hyperlink"/>
@@ -26966,8 +27251,8 @@
         </w:r>
       </w:hyperlink>
     </w:p>
-    <w:bookmarkEnd w:id="297"/>
-    <w:bookmarkStart w:id="299" w:name="ref-osterhout1992"/>
+    <w:bookmarkEnd w:id="305"/>
+    <w:bookmarkStart w:id="307" w:name="ref-osterhout1992"/>
     <w:p>
       <w:pPr>
         <w:pStyle w:val="Bibliography"/>
@@ -27004,7 +27289,7 @@
       <w:r>
         <w:t xml:space="preserve"> </w:t>
       </w:r>
-      <w:hyperlink r:id="rId298">
+      <w:hyperlink r:id="rId306">
         <w:r>
           <w:rPr>
             <w:rStyle w:val="Hyperlink"/>
@@ -27013,8 +27298,8 @@
         </w:r>
       </w:hyperlink>
     </w:p>
-    <w:bookmarkEnd w:id="299"/>
-    <w:bookmarkStart w:id="301" w:name="ref-osterhout2006"/>
+    <w:bookmarkEnd w:id="307"/>
+    <w:bookmarkStart w:id="309" w:name="ref-osterhout2006"/>
     <w:p>
       <w:pPr>
         <w:pStyle w:val="Bibliography"/>
@@ -27051,7 +27336,7 @@
       <w:r>
         <w:t xml:space="preserve"> </w:t>
       </w:r>
-      <w:hyperlink r:id="rId300">
+      <w:hyperlink r:id="rId308">
         <w:r>
           <w:rPr>
             <w:rStyle w:val="Hyperlink"/>
@@ -27060,8 +27345,8 @@
         </w:r>
       </w:hyperlink>
     </w:p>
-    <w:bookmarkEnd w:id="301"/>
-    <w:bookmarkStart w:id="303" w:name="ref-peelen2023"/>
+    <w:bookmarkEnd w:id="309"/>
+    <w:bookmarkStart w:id="311" w:name="ref-peelen2023"/>
     <w:p>
       <w:pPr>
         <w:pStyle w:val="Bibliography"/>
@@ -27098,7 +27383,7 @@
       <w:r>
         <w:t xml:space="preserve"> </w:t>
       </w:r>
-      <w:hyperlink r:id="rId302">
+      <w:hyperlink r:id="rId310">
         <w:r>
           <w:rPr>
             <w:rStyle w:val="Hyperlink"/>
@@ -27107,8 +27392,8 @@
         </w:r>
       </w:hyperlink>
     </w:p>
-    <w:bookmarkEnd w:id="303"/>
-    <w:bookmarkStart w:id="305" w:name="ref-pereirasoares2022"/>
+    <w:bookmarkEnd w:id="311"/>
+    <w:bookmarkStart w:id="313" w:name="ref-pereirasoares2022"/>
     <w:p>
       <w:pPr>
         <w:pStyle w:val="Bibliography"/>
@@ -27169,7 +27454,7 @@
       <w:r>
         <w:t xml:space="preserve"> </w:t>
       </w:r>
-      <w:hyperlink r:id="rId304">
+      <w:hyperlink r:id="rId312">
         <w:r>
           <w:rPr>
             <w:rStyle w:val="Hyperlink"/>
@@ -27178,8 +27463,8 @@
         </w:r>
       </w:hyperlink>
     </w:p>
-    <w:bookmarkEnd w:id="305"/>
-    <w:bookmarkStart w:id="307" w:name="ref-phipson2010"/>
+    <w:bookmarkEnd w:id="313"/>
+    <w:bookmarkStart w:id="315" w:name="ref-phipson2010"/>
     <w:p>
       <w:pPr>
         <w:pStyle w:val="Bibliography"/>
@@ -27234,7 +27519,7 @@
       <w:r>
         <w:t xml:space="preserve"> </w:t>
       </w:r>
-      <w:hyperlink r:id="rId306">
+      <w:hyperlink r:id="rId314">
         <w:r>
           <w:rPr>
             <w:rStyle w:val="Hyperlink"/>
@@ -27243,8 +27528,8 @@
         </w:r>
       </w:hyperlink>
     </w:p>
-    <w:bookmarkEnd w:id="307"/>
-    <w:bookmarkStart w:id="309" w:name="ref-puigmayenco2020"/>
+    <w:bookmarkEnd w:id="315"/>
+    <w:bookmarkStart w:id="317" w:name="ref-puigmayenco2020"/>
     <w:p>
       <w:pPr>
         <w:pStyle w:val="Bibliography"/>
@@ -27281,7 +27566,7 @@
       <w:r>
         <w:t xml:space="preserve"> </w:t>
       </w:r>
-      <w:hyperlink r:id="rId308">
+      <w:hyperlink r:id="rId316">
         <w:r>
           <w:rPr>
             <w:rStyle w:val="Hyperlink"/>
@@ -27290,8 +27575,8 @@
         </w:r>
       </w:hyperlink>
     </w:p>
-    <w:bookmarkEnd w:id="309"/>
-    <w:bookmarkStart w:id="311" w:name="ref-rcoreteam"/>
+    <w:bookmarkEnd w:id="317"/>
+    <w:bookmarkStart w:id="319" w:name="ref-rcoreteam"/>
     <w:p>
       <w:pPr>
         <w:pStyle w:val="Bibliography"/>
@@ -27315,7 +27600,7 @@
       <w:r>
         <w:t xml:space="preserve"> </w:t>
       </w:r>
-      <w:hyperlink r:id="rId310">
+      <w:hyperlink r:id="rId318">
         <w:r>
           <w:rPr>
             <w:rStyle w:val="Hyperlink"/>
@@ -27324,8 +27609,8 @@
         </w:r>
       </w:hyperlink>
     </w:p>
-    <w:bookmarkEnd w:id="311"/>
-    <w:bookmarkStart w:id="313" w:name="ref-ritchie2019"/>
+    <w:bookmarkEnd w:id="319"/>
+    <w:bookmarkStart w:id="321" w:name="ref-ritchie2019"/>
     <w:p>
       <w:pPr>
         <w:pStyle w:val="Bibliography"/>
@@ -27362,7 +27647,7 @@
       <w:r>
         <w:t xml:space="preserve"> </w:t>
       </w:r>
-      <w:hyperlink r:id="rId312">
+      <w:hyperlink r:id="rId320">
         <w:r>
           <w:rPr>
             <w:rStyle w:val="Hyperlink"/>
@@ -27371,8 +27656,8 @@
         </w:r>
       </w:hyperlink>
     </w:p>
-    <w:bookmarkEnd w:id="313"/>
-    <w:bookmarkStart w:id="315" w:name="ref-robertson2004"/>
+    <w:bookmarkEnd w:id="321"/>
+    <w:bookmarkStart w:id="323" w:name="ref-robertson2004"/>
     <w:p>
       <w:pPr>
         <w:pStyle w:val="Bibliography"/>
@@ -27409,7 +27694,7 @@
       <w:r>
         <w:t xml:space="preserve"> </w:t>
       </w:r>
-      <w:hyperlink r:id="rId314">
+      <w:hyperlink r:id="rId322">
         <w:r>
           <w:rPr>
             <w:rStyle w:val="Hyperlink"/>
@@ -27418,8 +27703,8 @@
         </w:r>
       </w:hyperlink>
     </w:p>
-    <w:bookmarkEnd w:id="315"/>
-    <w:bookmarkStart w:id="317" w:name="ref-rothman2011"/>
+    <w:bookmarkEnd w:id="323"/>
+    <w:bookmarkStart w:id="325" w:name="ref-rothman2011"/>
     <w:p>
       <w:pPr>
         <w:pStyle w:val="Bibliography"/>
@@ -27468,7 +27753,7 @@
       <w:r>
         <w:t xml:space="preserve"> </w:t>
       </w:r>
-      <w:hyperlink r:id="rId316">
+      <w:hyperlink r:id="rId324">
         <w:r>
           <w:rPr>
             <w:rStyle w:val="Hyperlink"/>
@@ -27477,8 +27762,8 @@
         </w:r>
       </w:hyperlink>
     </w:p>
-    <w:bookmarkEnd w:id="317"/>
-    <w:bookmarkStart w:id="319" w:name="ref-rothman2015"/>
+    <w:bookmarkEnd w:id="325"/>
+    <w:bookmarkStart w:id="327" w:name="ref-rothman2015"/>
     <w:p>
       <w:pPr>
         <w:pStyle w:val="Bibliography"/>
@@ -27539,7 +27824,7 @@
       <w:r>
         <w:t xml:space="preserve"> </w:t>
       </w:r>
-      <w:hyperlink r:id="rId318">
+      <w:hyperlink r:id="rId326">
         <w:r>
           <w:rPr>
             <w:rStyle w:val="Hyperlink"/>
@@ -27548,8 +27833,8 @@
         </w:r>
       </w:hyperlink>
     </w:p>
-    <w:bookmarkEnd w:id="319"/>
-    <w:bookmarkStart w:id="321" w:name="ref-rothmanalemanbanon2015"/>
+    <w:bookmarkEnd w:id="327"/>
+    <w:bookmarkStart w:id="329" w:name="ref-rothmanalemanbanon2015"/>
     <w:p>
       <w:pPr>
         <w:pStyle w:val="Bibliography"/>
@@ -27598,7 +27883,7 @@
       <w:r>
         <w:t xml:space="preserve"> </w:t>
       </w:r>
-      <w:hyperlink r:id="rId320">
+      <w:hyperlink r:id="rId328">
         <w:r>
           <w:rPr>
             <w:rStyle w:val="Hyperlink"/>
@@ -27607,8 +27892,8 @@
         </w:r>
       </w:hyperlink>
     </w:p>
-    <w:bookmarkEnd w:id="321"/>
-    <w:bookmarkStart w:id="323" w:name="ref-rothman2019"/>
+    <w:bookmarkEnd w:id="329"/>
+    <w:bookmarkStart w:id="331" w:name="ref-rothman2019"/>
     <w:p>
       <w:pPr>
         <w:pStyle w:val="Bibliography"/>
@@ -27632,7 +27917,7 @@
       <w:r>
         <w:t xml:space="preserve"> </w:t>
       </w:r>
-      <w:hyperlink r:id="rId322">
+      <w:hyperlink r:id="rId330">
         <w:r>
           <w:rPr>
             <w:rStyle w:val="Hyperlink"/>
@@ -27641,8 +27926,8 @@
         </w:r>
       </w:hyperlink>
     </w:p>
-    <w:bookmarkEnd w:id="323"/>
-    <w:bookmarkStart w:id="325" w:name="ref-rubin2021"/>
+    <w:bookmarkEnd w:id="331"/>
+    <w:bookmarkStart w:id="333" w:name="ref-rubin2021"/>
     <w:p>
       <w:pPr>
         <w:pStyle w:val="Bibliography"/>
@@ -27679,7 +27964,7 @@
       <w:r>
         <w:t xml:space="preserve"> </w:t>
       </w:r>
-      <w:hyperlink r:id="rId324">
+      <w:hyperlink r:id="rId332">
         <w:r>
           <w:rPr>
             <w:rStyle w:val="Hyperlink"/>
@@ -27688,8 +27973,8 @@
         </w:r>
       </w:hyperlink>
     </w:p>
-    <w:bookmarkEnd w:id="325"/>
-    <w:bookmarkStart w:id="327" w:name="ref-sassenhagen2019cluster"/>
+    <w:bookmarkEnd w:id="333"/>
+    <w:bookmarkStart w:id="335" w:name="ref-sassenhagen2019cluster"/>
     <w:p>
       <w:pPr>
         <w:pStyle w:val="Bibliography"/>
@@ -27744,7 +28029,7 @@
       <w:r>
         <w:t xml:space="preserve"> </w:t>
       </w:r>
-      <w:hyperlink r:id="rId326">
+      <w:hyperlink r:id="rId334">
         <w:r>
           <w:rPr>
             <w:rStyle w:val="Hyperlink"/>
@@ -27753,8 +28038,8 @@
         </w:r>
       </w:hyperlink>
     </w:p>
-    <w:bookmarkEnd w:id="327"/>
-    <w:bookmarkStart w:id="329" w:name="ref-sassenhagen2019"/>
+    <w:bookmarkEnd w:id="335"/>
+    <w:bookmarkStart w:id="337" w:name="ref-sassenhagen2019"/>
     <w:p>
       <w:pPr>
         <w:pStyle w:val="Bibliography"/>
@@ -27812,7 +28097,7 @@
       <w:r>
         <w:t xml:space="preserve"> </w:t>
       </w:r>
-      <w:hyperlink r:id="rId328">
+      <w:hyperlink r:id="rId336">
         <w:r>
           <w:rPr>
             <w:rStyle w:val="Hyperlink"/>
@@ -27821,8 +28106,8 @@
         </w:r>
       </w:hyperlink>
     </w:p>
-    <w:bookmarkEnd w:id="329"/>
-    <w:bookmarkStart w:id="331" w:name="ref-schad2021"/>
+    <w:bookmarkEnd w:id="337"/>
+    <w:bookmarkStart w:id="339" w:name="ref-schad2021"/>
     <w:p>
       <w:pPr>
         <w:pStyle w:val="Bibliography"/>
@@ -27871,7 +28156,7 @@
       <w:r>
         <w:t xml:space="preserve"> </w:t>
       </w:r>
-      <w:hyperlink r:id="rId330">
+      <w:hyperlink r:id="rId338">
         <w:r>
           <w:rPr>
             <w:rStyle w:val="Hyperlink"/>
@@ -27880,8 +28165,8 @@
         </w:r>
       </w:hyperlink>
     </w:p>
-    <w:bookmarkEnd w:id="331"/>
-    <w:bookmarkStart w:id="333" w:name="ref-schielzeth2010"/>
+    <w:bookmarkEnd w:id="339"/>
+    <w:bookmarkStart w:id="341" w:name="ref-schielzeth2010"/>
     <w:p>
       <w:pPr>
         <w:pStyle w:val="Bibliography"/>
@@ -27918,7 +28203,7 @@
       <w:r>
         <w:t xml:space="preserve"> </w:t>
       </w:r>
-      <w:hyperlink r:id="rId332">
+      <w:hyperlink r:id="rId340">
         <w:r>
           <w:rPr>
             <w:rStyle w:val="Hyperlink"/>
@@ -27927,8 +28212,8 @@
         </w:r>
       </w:hyperlink>
     </w:p>
-    <w:bookmarkEnd w:id="333"/>
-    <w:bookmarkStart w:id="335" w:name="ref-schwartzsprouse2021"/>
+    <w:bookmarkEnd w:id="341"/>
+    <w:bookmarkStart w:id="343" w:name="ref-schwartzsprouse2021"/>
     <w:p>
       <w:pPr>
         <w:pStyle w:val="Bibliography"/>
@@ -27989,7 +28274,7 @@
       <w:r>
         <w:t xml:space="preserve"> </w:t>
       </w:r>
-      <w:hyperlink r:id="rId334">
+      <w:hyperlink r:id="rId342">
         <w:r>
           <w:rPr>
             <w:rStyle w:val="Hyperlink"/>
@@ -27998,8 +28283,8 @@
         </w:r>
       </w:hyperlink>
     </w:p>
-    <w:bookmarkEnd w:id="335"/>
-    <w:bookmarkStart w:id="337" w:name="ref-silva2017"/>
+    <w:bookmarkEnd w:id="343"/>
+    <w:bookmarkStart w:id="345" w:name="ref-silva2017"/>
     <w:p>
       <w:pPr>
         <w:pStyle w:val="Bibliography"/>
@@ -28048,7 +28333,7 @@
       <w:r>
         <w:t xml:space="preserve"> </w:t>
       </w:r>
-      <w:hyperlink r:id="rId336">
+      <w:hyperlink r:id="rId344">
         <w:r>
           <w:rPr>
             <w:rStyle w:val="Hyperlink"/>
@@ -28057,8 +28342,8 @@
         </w:r>
       </w:hyperlink>
     </w:p>
-    <w:bookmarkEnd w:id="337"/>
-    <w:bookmarkStart w:id="339" w:name="ref-skalba2026"/>
+    <w:bookmarkEnd w:id="345"/>
+    <w:bookmarkStart w:id="347" w:name="ref-skalba2026"/>
     <w:p>
       <w:pPr>
         <w:pStyle w:val="Bibliography"/>
@@ -28094,7 +28379,7 @@
       <w:r>
         <w:t xml:space="preserve"> </w:t>
       </w:r>
-      <w:hyperlink r:id="rId338">
+      <w:hyperlink r:id="rId346">
         <w:r>
           <w:rPr>
             <w:rStyle w:val="Hyperlink"/>
@@ -28103,8 +28388,8 @@
         </w:r>
       </w:hyperlink>
     </w:p>
-    <w:bookmarkEnd w:id="339"/>
-    <w:bookmarkStart w:id="341" w:name="ref-slabakova2017"/>
+    <w:bookmarkEnd w:id="347"/>
+    <w:bookmarkStart w:id="349" w:name="ref-slabakova2017"/>
     <w:p>
       <w:pPr>
         <w:pStyle w:val="Bibliography"/>
@@ -28141,7 +28426,7 @@
       <w:r>
         <w:t xml:space="preserve"> </w:t>
       </w:r>
-      <w:hyperlink r:id="rId340">
+      <w:hyperlink r:id="rId348">
         <w:r>
           <w:rPr>
             <w:rStyle w:val="Hyperlink"/>
@@ -28150,8 +28435,8 @@
         </w:r>
       </w:hyperlink>
     </w:p>
-    <w:bookmarkEnd w:id="341"/>
-    <w:bookmarkStart w:id="343" w:name="ref-tamminen2015"/>
+    <w:bookmarkEnd w:id="349"/>
+    <w:bookmarkStart w:id="351" w:name="ref-tamminen2015"/>
     <w:p>
       <w:pPr>
         <w:pStyle w:val="Bibliography"/>
@@ -28188,7 +28473,7 @@
       <w:r>
         <w:t xml:space="preserve"> </w:t>
       </w:r>
-      <w:hyperlink r:id="rId342">
+      <w:hyperlink r:id="rId350">
         <w:r>
           <w:rPr>
             <w:rStyle w:val="Hyperlink"/>
@@ -28197,8 +28482,8 @@
         </w:r>
       </w:hyperlink>
     </w:p>
-    <w:bookmarkEnd w:id="343"/>
-    <w:bookmarkStart w:id="345" w:name="ref-tanner2013"/>
+    <w:bookmarkEnd w:id="351"/>
+    <w:bookmarkStart w:id="353" w:name="ref-tanner2013"/>
     <w:p>
       <w:pPr>
         <w:pStyle w:val="Bibliography"/>
@@ -28259,7 +28544,7 @@
       <w:r>
         <w:t xml:space="preserve"> </w:t>
       </w:r>
-      <w:hyperlink r:id="rId344">
+      <w:hyperlink r:id="rId352">
         <w:r>
           <w:rPr>
             <w:rStyle w:val="Hyperlink"/>
@@ -28268,8 +28553,8 @@
         </w:r>
       </w:hyperlink>
     </w:p>
-    <w:bookmarkEnd w:id="345"/>
-    <w:bookmarkStart w:id="347" w:name="ref-tanner2015"/>
+    <w:bookmarkEnd w:id="353"/>
+    <w:bookmarkStart w:id="355" w:name="ref-tanner2015"/>
     <w:p>
       <w:pPr>
         <w:pStyle w:val="Bibliography"/>
@@ -28318,7 +28603,7 @@
       <w:r>
         <w:t xml:space="preserve"> </w:t>
       </w:r>
-      <w:hyperlink r:id="rId346">
+      <w:hyperlink r:id="rId354">
         <w:r>
           <w:rPr>
             <w:rStyle w:val="Hyperlink"/>
@@ -28327,8 +28612,8 @@
         </w:r>
       </w:hyperlink>
     </w:p>
-    <w:bookmarkEnd w:id="347"/>
-    <w:bookmarkStart w:id="349" w:name="ref-tanner2014"/>
+    <w:bookmarkEnd w:id="355"/>
+    <w:bookmarkStart w:id="357" w:name="ref-tanner2014"/>
     <w:p>
       <w:pPr>
         <w:pStyle w:val="Bibliography"/>
@@ -28377,7 +28662,7 @@
       <w:r>
         <w:t xml:space="preserve"> </w:t>
       </w:r>
-      <w:hyperlink r:id="rId348">
+      <w:hyperlink r:id="rId356">
         <w:r>
           <w:rPr>
             <w:rStyle w:val="Hyperlink"/>
@@ -28386,8 +28671,8 @@
         </w:r>
       </w:hyperlink>
     </w:p>
-    <w:bookmarkEnd w:id="349"/>
-    <w:bookmarkStart w:id="351" w:name="ref-teichmann2022"/>
+    <w:bookmarkEnd w:id="357"/>
+    <w:bookmarkStart w:id="359" w:name="ref-teichmann2022"/>
     <w:p>
       <w:pPr>
         <w:pStyle w:val="Bibliography"/>
@@ -28448,7 +28733,7 @@
       <w:r>
         <w:t xml:space="preserve"> </w:t>
       </w:r>
-      <w:hyperlink r:id="rId350">
+      <w:hyperlink r:id="rId358">
         <w:r>
           <w:rPr>
             <w:rStyle w:val="Hyperlink"/>
@@ -28457,8 +28742,8 @@
         </w:r>
       </w:hyperlink>
     </w:p>
-    <w:bookmarkEnd w:id="351"/>
-    <w:bookmarkStart w:id="353" w:name="ref-vandeschoot2021"/>
+    <w:bookmarkEnd w:id="359"/>
+    <w:bookmarkStart w:id="361" w:name="ref-vandeschoot2021"/>
     <w:p>
       <w:pPr>
         <w:pStyle w:val="Bibliography"/>
@@ -28507,7 +28792,7 @@
       <w:r>
         <w:t xml:space="preserve"> </w:t>
       </w:r>
-      <w:hyperlink r:id="rId352">
+      <w:hyperlink r:id="rId360">
         <w:r>
           <w:rPr>
             <w:rStyle w:val="Hyperlink"/>
@@ -28516,8 +28801,8 @@
         </w:r>
       </w:hyperlink>
     </w:p>
-    <w:bookmarkEnd w:id="353"/>
-    <w:bookmarkStart w:id="355" w:name="ref-varoquaux2018"/>
+    <w:bookmarkEnd w:id="361"/>
+    <w:bookmarkStart w:id="363" w:name="ref-varoquaux2018"/>
     <w:p>
       <w:pPr>
         <w:pStyle w:val="Bibliography"/>
@@ -28554,7 +28839,7 @@
       <w:r>
         <w:t xml:space="preserve"> </w:t>
       </w:r>
-      <w:hyperlink r:id="rId354">
+      <w:hyperlink r:id="rId362">
         <w:r>
           <w:rPr>
             <w:rStyle w:val="Hyperlink"/>
@@ -28563,8 +28848,8 @@
         </w:r>
       </w:hyperlink>
     </w:p>
-    <w:bookmarkEnd w:id="355"/>
-    <w:bookmarkStart w:id="357" w:name="ref-varoquaux2017"/>
+    <w:bookmarkEnd w:id="363"/>
+    <w:bookmarkStart w:id="365" w:name="ref-varoquaux2017"/>
     <w:p>
       <w:pPr>
         <w:pStyle w:val="Bibliography"/>
@@ -28601,7 +28886,7 @@
       <w:r>
         <w:t xml:space="preserve"> </w:t>
       </w:r>
-      <w:hyperlink r:id="rId356">
+      <w:hyperlink r:id="rId364">
         <w:r>
           <w:rPr>
             <w:rStyle w:val="Hyperlink"/>
@@ -28610,8 +28895,8 @@
         </w:r>
       </w:hyperlink>
     </w:p>
-    <w:bookmarkEnd w:id="357"/>
-    <w:bookmarkStart w:id="359" w:name="ref-vasishth2018"/>
+    <w:bookmarkEnd w:id="365"/>
+    <w:bookmarkStart w:id="367" w:name="ref-vasishth2018"/>
     <w:p>
       <w:pPr>
         <w:pStyle w:val="Bibliography"/>
@@ -28648,7 +28933,7 @@
       <w:r>
         <w:t xml:space="preserve"> </w:t>
       </w:r>
-      <w:hyperlink r:id="rId358">
+      <w:hyperlink r:id="rId366">
         <w:r>
           <w:rPr>
             <w:rStyle w:val="Hyperlink"/>
@@ -28657,8 +28942,8 @@
         </w:r>
       </w:hyperlink>
     </w:p>
-    <w:bookmarkEnd w:id="359"/>
-    <w:bookmarkStart w:id="361" w:name="ref-vehtari2021"/>
+    <w:bookmarkEnd w:id="367"/>
+    <w:bookmarkStart w:id="369" w:name="ref-vehtari2021"/>
     <w:p>
       <w:pPr>
         <w:pStyle w:val="Bibliography"/>
@@ -28728,7 +29013,7 @@
       <w:r>
         <w:t xml:space="preserve"> </w:t>
       </w:r>
-      <w:hyperlink r:id="rId360">
+      <w:hyperlink r:id="rId368">
         <w:r>
           <w:rPr>
             <w:rStyle w:val="Hyperlink"/>
@@ -28737,8 +29022,8 @@
         </w:r>
       </w:hyperlink>
     </w:p>
-    <w:bookmarkEnd w:id="361"/>
-    <w:bookmarkStart w:id="363" w:name="ref-volpertesmond2021"/>
+    <w:bookmarkEnd w:id="369"/>
+    <w:bookmarkStart w:id="371" w:name="ref-volpertesmond2021"/>
     <w:p>
       <w:pPr>
         <w:pStyle w:val="Bibliography"/>
@@ -28775,7 +29060,7 @@
       <w:r>
         <w:t xml:space="preserve"> </w:t>
       </w:r>
-      <w:hyperlink r:id="rId362">
+      <w:hyperlink r:id="rId370">
         <w:r>
           <w:rPr>
             <w:rStyle w:val="Hyperlink"/>
@@ -28784,8 +29069,8 @@
         </w:r>
       </w:hyperlink>
     </w:p>
-    <w:bookmarkEnd w:id="363"/>
-    <w:bookmarkStart w:id="365" w:name="ref-wagenmakers2012"/>
+    <w:bookmarkEnd w:id="371"/>
+    <w:bookmarkStart w:id="373" w:name="ref-wagenmakers2012"/>
     <w:p>
       <w:pPr>
         <w:pStyle w:val="Bibliography"/>
@@ -28822,7 +29107,7 @@
       <w:r>
         <w:t xml:space="preserve"> </w:t>
       </w:r>
-      <w:hyperlink r:id="rId364">
+      <w:hyperlink r:id="rId372">
         <w:r>
           <w:rPr>
             <w:rStyle w:val="Hyperlink"/>
@@ -28831,8 +29116,8 @@
         </w:r>
       </w:hyperlink>
     </w:p>
-    <w:bookmarkEnd w:id="365"/>
-    <w:bookmarkStart w:id="367" w:name="ref-wang2024"/>
+    <w:bookmarkEnd w:id="373"/>
+    <w:bookmarkStart w:id="375" w:name="ref-wang2024"/>
     <w:p>
       <w:pPr>
         <w:pStyle w:val="Bibliography"/>
@@ -28893,7 +29178,7 @@
       <w:r>
         <w:t xml:space="preserve"> </w:t>
       </w:r>
-      <w:hyperlink r:id="rId366">
+      <w:hyperlink r:id="rId374">
         <w:r>
           <w:rPr>
             <w:rStyle w:val="Hyperlink"/>
@@ -28902,8 +29187,8 @@
         </w:r>
       </w:hyperlink>
     </w:p>
-    <w:bookmarkEnd w:id="367"/>
-    <w:bookmarkStart w:id="369" w:name="ref-westergaard2021"/>
+    <w:bookmarkEnd w:id="375"/>
+    <w:bookmarkStart w:id="377" w:name="ref-westergaard2021"/>
     <w:p>
       <w:pPr>
         <w:pStyle w:val="Bibliography"/>
@@ -28940,7 +29225,7 @@
       <w:r>
         <w:t xml:space="preserve"> </w:t>
       </w:r>
-      <w:hyperlink r:id="rId368">
+      <w:hyperlink r:id="rId376">
         <w:r>
           <w:rPr>
             <w:rStyle w:val="Hyperlink"/>
@@ -28949,8 +29234,8 @@
         </w:r>
       </w:hyperlink>
     </w:p>
-    <w:bookmarkEnd w:id="369"/>
-    <w:bookmarkStart w:id="371" w:name="ref-westergaard2017"/>
+    <w:bookmarkEnd w:id="377"/>
+    <w:bookmarkStart w:id="379" w:name="ref-westergaard2017"/>
     <w:p>
       <w:pPr>
         <w:pStyle w:val="Bibliography"/>
@@ -28996,7 +29281,7 @@
       <w:r>
         <w:t xml:space="preserve"> </w:t>
       </w:r>
-      <w:hyperlink r:id="rId370">
+      <w:hyperlink r:id="rId378">
         <w:r>
           <w:rPr>
             <w:rStyle w:val="Hyperlink"/>
@@ -29005,8 +29290,8 @@
         </w:r>
       </w:hyperlink>
     </w:p>
-    <w:bookmarkEnd w:id="371"/>
-    <w:bookmarkStart w:id="373" w:name="ref-westergaard2023"/>
+    <w:bookmarkEnd w:id="379"/>
+    <w:bookmarkStart w:id="381" w:name="ref-westergaard2023"/>
     <w:p>
       <w:pPr>
         <w:pStyle w:val="Bibliography"/>
@@ -29045,7 +29330,7 @@
       <w:r>
         <w:t xml:space="preserve"> </w:t>
       </w:r>
-      <w:hyperlink r:id="rId372">
+      <w:hyperlink r:id="rId380">
         <w:r>
           <w:rPr>
             <w:rStyle w:val="Hyperlink"/>
@@ -29054,8 +29339,8 @@
         </w:r>
       </w:hyperlink>
     </w:p>
-    <w:bookmarkEnd w:id="373"/>
-    <w:bookmarkStart w:id="375" w:name="ref-white2012"/>
+    <w:bookmarkEnd w:id="381"/>
+    <w:bookmarkStart w:id="383" w:name="ref-white2012"/>
     <w:p>
       <w:pPr>
         <w:pStyle w:val="Bibliography"/>
@@ -29092,7 +29377,7 @@
       <w:r>
         <w:t xml:space="preserve"> </w:t>
       </w:r>
-      <w:hyperlink r:id="rId374">
+      <w:hyperlink r:id="rId382">
         <w:r>
           <w:rPr>
             <w:rStyle w:val="Hyperlink"/>
@@ -29101,8 +29386,8 @@
         </w:r>
       </w:hyperlink>
     </w:p>
-    <w:bookmarkEnd w:id="375"/>
-    <w:bookmarkStart w:id="377" w:name="ref-wickham2016"/>
+    <w:bookmarkEnd w:id="383"/>
+    <w:bookmarkStart w:id="385" w:name="ref-wickham2016"/>
     <w:p>
       <w:pPr>
         <w:pStyle w:val="Bibliography"/>
@@ -29133,7 +29418,7 @@
       <w:r>
         <w:t xml:space="preserve"> </w:t>
       </w:r>
-      <w:hyperlink r:id="rId376">
+      <w:hyperlink r:id="rId384">
         <w:r>
           <w:rPr>
             <w:rStyle w:val="Hyperlink"/>
@@ -29142,8 +29427,8 @@
         </w:r>
       </w:hyperlink>
     </w:p>
-    <w:bookmarkEnd w:id="377"/>
-    <w:bookmarkStart w:id="379" w:name="ref-widmann2015"/>
+    <w:bookmarkEnd w:id="385"/>
+    <w:bookmarkStart w:id="387" w:name="ref-widmann2015"/>
     <w:p>
       <w:pPr>
         <w:pStyle w:val="Bibliography"/>
@@ -29180,7 +29465,7 @@
       <w:r>
         <w:t xml:space="preserve"> </w:t>
       </w:r>
-      <w:hyperlink r:id="rId378">
+      <w:hyperlink r:id="rId386">
         <w:r>
           <w:rPr>
             <w:rStyle w:val="Hyperlink"/>
@@ -29189,8 +29474,8 @@
         </w:r>
       </w:hyperlink>
     </w:p>
-    <w:bookmarkEnd w:id="379"/>
-    <w:bookmarkStart w:id="381" w:name="ref-xu2024"/>
+    <w:bookmarkEnd w:id="387"/>
+    <w:bookmarkStart w:id="389" w:name="ref-xu2024"/>
     <w:p>
       <w:pPr>
         <w:pStyle w:val="Bibliography"/>
@@ -29227,7 +29512,7 @@
       <w:r>
         <w:t xml:space="preserve"> </w:t>
       </w:r>
-      <w:hyperlink r:id="rId380">
+      <w:hyperlink r:id="rId388">
         <w:r>
           <w:rPr>
             <w:rStyle w:val="Hyperlink"/>
@@ -29236,8 +29521,8 @@
         </w:r>
       </w:hyperlink>
     </w:p>
-    <w:bookmarkEnd w:id="381"/>
-    <w:bookmarkStart w:id="383" w:name="ref-zhao2025"/>
+    <w:bookmarkEnd w:id="389"/>
+    <w:bookmarkStart w:id="391" w:name="ref-zhao2025"/>
     <w:p>
       <w:pPr>
         <w:pStyle w:val="Bibliography"/>
@@ -29274,7 +29559,7 @@
       <w:r>
         <w:t xml:space="preserve"> </w:t>
       </w:r>
-      <w:hyperlink r:id="rId382">
+      <w:hyperlink r:id="rId390">
         <w:r>
           <w:rPr>
             <w:rStyle w:val="Hyperlink"/>
@@ -29283,8 +29568,8 @@
         </w:r>
       </w:hyperlink>
     </w:p>
-    <w:bookmarkEnd w:id="383"/>
-    <w:bookmarkEnd w:id="384"/>
+    <w:bookmarkEnd w:id="391"/>
+    <w:bookmarkEnd w:id="392"/>
     <w:p>
       <w:pPr>
         <w:pStyle w:val="Heading1"/>
@@ -29293,7 +29578,7 @@
         <w:t xml:space="preserve">Appendix A</w:t>
       </w:r>
     </w:p>
-    <w:bookmarkStart w:id="389" w:name="apx-analytic-decisions-in-detail"/>
+    <w:bookmarkStart w:id="397" w:name="apx-analytic-decisions-in-detail"/>
     <w:p>
       <w:pPr>
         <w:pStyle w:val="Heading1"/>
@@ -29328,7 +29613,7 @@
         <w:t xml:space="preserve">decoding analyses.</w:t>
       </w:r>
     </w:p>
-    <w:bookmarkStart w:id="385" w:name="the-by-item-grammaticality-slope"/>
+    <w:bookmarkStart w:id="393" w:name="the-by-item-grammaticality-slope"/>
     <w:p>
       <w:pPr>
         <w:pStyle w:val="Heading2"/>
@@ -29500,8 +29785,8 @@
         <w:t xml:space="preserve">comparison follows.</w:t>
       </w:r>
     </w:p>
-    <w:bookmarkEnd w:id="385"/>
-    <w:bookmarkStart w:id="386" w:name="X61f9105b9c4f67c8a70721911d2ac0c431d2f53"/>
+    <w:bookmarkEnd w:id="393"/>
+    <w:bookmarkStart w:id="394" w:name="X61f9105b9c4f67c8a70721911d2ac0c431d2f53"/>
     <w:p>
       <w:pPr>
         <w:pStyle w:val="Heading2"/>
@@ -29720,8 +30005,8 @@
         <w:t xml:space="preserve">while the existence and direction of the effect hold under both.</w:t>
       </w:r>
     </w:p>
-    <w:bookmarkEnd w:id="386"/>
-    <w:bookmarkStart w:id="387" w:name="the-session-3-filter-exclusion"/>
+    <w:bookmarkEnd w:id="394"/>
+    <w:bookmarkStart w:id="395" w:name="the-session-3-filter-exclusion"/>
     <w:p>
       <w:pPr>
         <w:pStyle w:val="Heading2"/>
@@ -29844,8 +30129,8 @@
         <w:t xml:space="preserve">results-contingent choice.</w:t>
       </w:r>
     </w:p>
-    <w:bookmarkEnd w:id="387"/>
-    <w:bookmarkStart w:id="388" w:name="the-decoding-correction-family"/>
+    <w:bookmarkEnd w:id="395"/>
+    <w:bookmarkStart w:id="396" w:name="the-decoding-correction-family"/>
     <w:p>
       <w:pPr>
         <w:pStyle w:val="Heading2"/>
@@ -29909,8 +30194,8 @@
         <w:br w:type="page"/>
       </w:r>
     </w:p>
-    <w:bookmarkEnd w:id="388"/>
-    <w:bookmarkEnd w:id="389"/>
+    <w:bookmarkEnd w:id="396"/>
+    <w:bookmarkEnd w:id="397"/>
     <w:p>
       <w:pPr>
         <w:pStyle w:val="Heading1"/>
@@ -29919,7 +30204,7 @@
         <w:t xml:space="preserve">Appendix B</w:t>
       </w:r>
     </w:p>
-    <w:bookmarkStart w:id="392" w:name="apx-retention-tables"/>
+    <w:bookmarkStart w:id="400" w:name="apx-retention-tables"/>
     <w:p>
       <w:pPr>
         <w:pStyle w:val="Heading1"/>
@@ -29982,7 +30267,7 @@
         <w:t xml:space="preserve">artefact and reproduce with it.</w:t>
       </w:r>
     </w:p>
-    <w:bookmarkStart w:id="390" w:name="tbl-retention"/>
+    <w:bookmarkStart w:id="398" w:name="tbl-retention"/>
     <w:p>
       <w:pPr>
         <w:pStyle w:val="FigureTitle"/>
@@ -38361,7 +38646,7 @@
         </w:tc>
       </w:tr>
     </w:tbl>
-    <w:bookmarkEnd w:id="390"/>
+    <w:bookmarkEnd w:id="398"/>
     <w:p>
       <w:pPr>
         <w:pStyle w:val="FigureNote"/>
@@ -38385,7 +38670,7 @@
         <w:t xml:space="preserve"> </w:t>
       </w:r>
     </w:p>
-    <w:bookmarkStart w:id="391" w:name="tbl-retention-free"/>
+    <w:bookmarkStart w:id="399" w:name="tbl-retention-free"/>
     <w:p>
       <w:pPr>
         <w:pStyle w:val="FigureTitle"/>
@@ -42647,7 +42932,7 @@
         </w:tc>
       </w:tr>
     </w:tbl>
-    <w:bookmarkEnd w:id="391"/>
+    <w:bookmarkEnd w:id="399"/>
     <w:p>
       <w:pPr>
         <w:pStyle w:val="FigureNote"/>
@@ -42668,7 +42953,7 @@
         <w:br w:type="page"/>
       </w:r>
     </w:p>
-    <w:bookmarkEnd w:id="392"/>
+    <w:bookmarkEnd w:id="400"/>
     <w:p>
       <w:pPr>
         <w:pStyle w:val="Heading1"/>
@@ -42677,7 +42962,7 @@
         <w:t xml:space="preserve">Appendix C</w:t>
       </w:r>
     </w:p>
-    <w:bookmarkStart w:id="394" w:name="apx-prior-specifications"/>
+    <w:bookmarkStart w:id="402" w:name="apx-prior-specifications"/>
     <w:p>
       <w:pPr>
         <w:pStyle w:val="Heading1"/>
@@ -42755,7 +43040,7 @@
         <w:t xml:space="preserve">default.</w:t>
       </w:r>
     </w:p>
-    <w:bookmarkStart w:id="393" w:name="tbl-priors"/>
+    <w:bookmarkStart w:id="401" w:name="tbl-priors"/>
     <w:p>
       <w:pPr>
         <w:pStyle w:val="FigureTitle"/>
@@ -43358,7 +43643,7 @@
         </w:tc>
       </w:tr>
     </w:tbl>
-    <w:bookmarkEnd w:id="393"/>
+    <w:bookmarkEnd w:id="401"/>
     <w:p>
       <w:pPr>
         <w:pStyle w:val="FigureNote"/>
@@ -43379,7 +43664,7 @@
         <w:br w:type="page"/>
       </w:r>
     </w:p>
-    <w:bookmarkEnd w:id="394"/>
+    <w:bookmarkEnd w:id="402"/>
     <w:p>
       <w:pPr>
         <w:pStyle w:val="Heading1"/>
@@ -43388,7 +43673,7 @@
         <w:t xml:space="preserve">Appendix D</w:t>
       </w:r>
     </w:p>
-    <w:bookmarkStart w:id="396" w:name="apx-convergence-diagnostics"/>
+    <w:bookmarkStart w:id="404" w:name="apx-convergence-diagnostics"/>
     <w:p>
       <w:pPr>
         <w:pStyle w:val="Heading1"/>
@@ -43494,7 +43779,7 @@
         <w:t xml:space="preserve">model that converged comfortably can be told from one that converged marginally.</w:t>
       </w:r>
     </w:p>
-    <w:bookmarkStart w:id="395" w:name="tbl-convergence-appendix"/>
+    <w:bookmarkStart w:id="403" w:name="tbl-convergence-appendix"/>
     <w:p>
       <w:pPr>
         <w:pStyle w:val="FigureTitle"/>
@@ -54824,7 +55109,7 @@
         </w:tc>
       </w:tr>
     </w:tbl>
-    <w:bookmarkEnd w:id="395"/>
+    <w:bookmarkEnd w:id="403"/>
     <w:p>
       <w:pPr>
         <w:pStyle w:val="FigureNote"/>
@@ -54908,7 +55193,7 @@
         <w:br w:type="page"/>
       </w:r>
     </w:p>
-    <w:bookmarkEnd w:id="396"/>
+    <w:bookmarkEnd w:id="404"/>
     <w:p>
       <w:pPr>
         <w:pStyle w:val="Heading1"/>
@@ -54917,7 +55202,7 @@
         <w:t xml:space="preserve">Appendix E</w:t>
       </w:r>
     </w:p>
-    <w:bookmarkStart w:id="401" w:name="apx-difference-waves"/>
+    <w:bookmarkStart w:id="409" w:name="apx-difference-waves"/>
     <w:p>
       <w:pPr>
         <w:pStyle w:val="Heading1"/>
@@ -54958,7 +55243,7 @@
           <w:rPr>
             <w:rStyle w:val="Hyperlink"/>
           </w:rPr>
-          <w:t xml:space="preserve">Figure 6</w:t>
+          <w:t xml:space="preserve">Figure 8</w:t>
         </w:r>
       </w:hyperlink>
       <w:r>
@@ -54989,7 +55274,7 @@
         <w:t xml:space="preserve">are dominated by the shared evoked response.</w:t>
       </w:r>
     </w:p>
-    <w:bookmarkStart w:id="400" w:name="fig-erp-difference"/>
+    <w:bookmarkStart w:id="408" w:name="fig-erp-difference"/>
     <w:p>
       <w:pPr>
         <w:pStyle w:val="FigureTitle"/>
@@ -55015,18 +55300,18 @@
           <wp:inline>
             <wp:extent cx="5943600" cy="3657599"/>
             <wp:effectExtent b="0" l="0" r="0" t="0"/>
-            <wp:docPr descr="" title="" id="398" name="Picture"/>
+            <wp:docPr descr="" title="" id="406" name="Picture"/>
             <a:graphic>
               <a:graphicData uri="http://schemas.openxmlformats.org/drawingml/2006/picture">
                 <pic:pic>
                   <pic:nvPicPr>
-                    <pic:cNvPr descr="paper_1_morphosyntax_files/figure-docx/fig-erp-difference-1.png" id="399" name="Picture"/>
+                    <pic:cNvPr descr="paper_1_morphosyntax_files/figure-docx/fig-erp-difference-1.png" id="407" name="Picture"/>
                     <pic:cNvPicPr>
                       <a:picLocks noChangeArrowheads="1" noChangeAspect="1"/>
                     </pic:cNvPicPr>
                   </pic:nvPicPr>
                   <pic:blipFill>
-                    <a:blip r:embed="rId397"/>
+                    <a:blip r:embed="rId405"/>
                     <a:stretch>
                       <a:fillRect/>
                     </a:stretch>
@@ -55053,7 +55338,7 @@
         </w:drawing>
       </w:r>
     </w:p>
-    <w:bookmarkEnd w:id="400"/>
+    <w:bookmarkEnd w:id="408"/>
     <w:p>
       <w:pPr>
         <w:pStyle w:val="FigureNote"/>
@@ -55086,7 +55371,7 @@
         <w:t xml:space="preserve">to 0 ms) is shaded, with window shading as in the waveform figure. The vertical axis is scaled separately for the two sites. These are descriptive condition averages with no uncertainty band, and the inferential statements come from the models. Like the waveforms, they are trial-weighted and computed on the full sample, including the four mis-filtered Session-3 datasets.</w:t>
       </w:r>
     </w:p>
-    <w:bookmarkEnd w:id="401"/>
+    <w:bookmarkEnd w:id="409"/>
     <w:sectPr>
       <w:headerReference r:id="rId8" w:type="even"/>
       <w:headerReference r:id="rId9" w:type="default"/>

</xml_diff>